<commit_message>
Documento versao 2.0: Secao VI com o script, a carga e os resultados das seis consultas
</commit_message>
<xml_diff>
--- a/documento/Laboratorio01_Grupo3.docx
+++ b/documento/Laboratorio01_Grupo3.docx
@@ -10664,6 +10664,115 @@
                 <w:szCs w:val="16"/>
               </w:rPr>
               <w:t xml:space="preserve">Versão inicial com as sete tabelas, relacionamentos, domínios e índices</w:t>
+            </w:r>
+          </w:p>
+        </w:tc>
+        <w:tc>
+          <w:tcPr>
+            <w:tcW w:type="dxa" w:w="1000"/>
+            <w:tcMar>
+              <w:top w:type="dxa" w:w="20"/>
+              <w:left w:type="dxa" w:w="60"/>
+              <w:bottom w:type="dxa" w:w="20"/>
+              <w:right w:type="dxa" w:w="60"/>
+            </w:tcMar>
+            <w:vAlign w:val="top"/>
+          </w:tcPr>
+          <w:p>
+            <w:pPr>
+              <w:spacing w:after="0" w:line="220"/>
+              <w:jc w:val="left"/>
+            </w:pPr>
+            <w:r>
+              <w:rPr>
+                <w:rFonts w:ascii="Times New Roman" w:cs="Times New Roman" w:eastAsia="Times New Roman" w:hAnsi="Times New Roman"/>
+                <w:sz w:val="16"/>
+                <w:szCs w:val="16"/>
+              </w:rPr>
+              <w:t xml:space="preserve">Grupo 3</w:t>
+            </w:r>
+          </w:p>
+        </w:tc>
+      </w:tr>
+      <w:tr>
+        <w:trPr>
+          <w:tblHeader w:val="false"/>
+        </w:trPr>
+        <w:tc>
+          <w:tcPr>
+            <w:tcW w:type="dxa" w:w="800"/>
+            <w:tcMar>
+              <w:top w:type="dxa" w:w="20"/>
+              <w:left w:type="dxa" w:w="60"/>
+              <w:bottom w:type="dxa" w:w="20"/>
+              <w:right w:type="dxa" w:w="60"/>
+            </w:tcMar>
+            <w:vAlign w:val="top"/>
+          </w:tcPr>
+          <w:p>
+            <w:pPr>
+              <w:spacing w:after="0" w:line="220"/>
+              <w:jc w:val="center"/>
+            </w:pPr>
+            <w:r>
+              <w:rPr>
+                <w:rFonts w:ascii="Times New Roman" w:cs="Times New Roman" w:eastAsia="Times New Roman" w:hAnsi="Times New Roman"/>
+                <w:sz w:val="16"/>
+                <w:szCs w:val="16"/>
+              </w:rPr>
+              <w:t xml:space="preserve">2.0</w:t>
+            </w:r>
+          </w:p>
+        </w:tc>
+        <w:tc>
+          <w:tcPr>
+            <w:tcW w:type="dxa" w:w="1000"/>
+            <w:tcMar>
+              <w:top w:type="dxa" w:w="20"/>
+              <w:left w:type="dxa" w:w="60"/>
+              <w:bottom w:type="dxa" w:w="20"/>
+              <w:right w:type="dxa" w:w="60"/>
+            </w:tcMar>
+            <w:vAlign w:val="top"/>
+          </w:tcPr>
+          <w:p>
+            <w:pPr>
+              <w:spacing w:after="0" w:line="220"/>
+              <w:jc w:val="center"/>
+            </w:pPr>
+            <w:r>
+              <w:rPr>
+                <w:rFonts w:ascii="Times New Roman" w:cs="Times New Roman" w:eastAsia="Times New Roman" w:hAnsi="Times New Roman"/>
+                <w:sz w:val="16"/>
+                <w:szCs w:val="16"/>
+              </w:rPr>
+              <w:t xml:space="preserve">29/09/2026</w:t>
+            </w:r>
+          </w:p>
+        </w:tc>
+        <w:tc>
+          <w:tcPr>
+            <w:tcW w:type="dxa" w:w="2073"/>
+            <w:tcMar>
+              <w:top w:type="dxa" w:w="20"/>
+              <w:left w:type="dxa" w:w="60"/>
+              <w:bottom w:type="dxa" w:w="20"/>
+              <w:right w:type="dxa" w:w="60"/>
+            </w:tcMar>
+            <w:vAlign w:val="top"/>
+          </w:tcPr>
+          <w:p>
+            <w:pPr>
+              <w:spacing w:after="0" w:line="220"/>
+              <w:jc w:val="left"/>
+            </w:pPr>
+            <w:r>
+              <w:rPr>
+                <w:rFonts w:ascii="Times New Roman" w:cs="Times New Roman" w:eastAsia="Times New Roman" w:hAnsi="Times New Roman"/>
+                <w:sz w:val="16"/>
+                <w:szCs w:val="16"/>
+              </w:rPr>
+              <w:t xml:space="preserve">Inclusão da Seção VI com o script de criação, a carga de dados e os resultados das seis consultas</w:t>
             </w:r>
           </w:p>
         </w:tc>
@@ -16647,9 +16756,8 @@
     </w:p>
     <w:p>
       <w:pPr>
-        <w:spacing w:after="0" w:line="240"/>
-        <w:ind w:firstLine="288"/>
-        <w:jc w:val="both"/>
+        <w:spacing w:after="60" w:before="120"/>
+        <w:jc w:val="left"/>
       </w:pPr>
       <w:r>
         <w:rPr>
@@ -16659,7 +16767,7 @@
           <w:sz w:val="20"/>
           <w:szCs w:val="20"/>
         </w:rPr>
-        <w:t xml:space="preserve">Conteúdo em elaboração. Esta versão do documento cobre as Etapas 1, 2 e 3. As capturas de tela das seis consultas serão inseridas nesta seção na versão 2.0, conforme o histórico da Tabela VII.</w:t>
+        <w:t xml:space="preserve">A. Script de criação e carga</w:t>
       </w:r>
     </w:p>
     <w:p>
@@ -16674,13 +16782,109 @@
           <w:sz w:val="20"/>
           <w:szCs w:val="20"/>
         </w:rPr>
-        <w:t xml:space="preserve">As consultas previstas são as seguintes.</w:t>
+        <w:t xml:space="preserve">O script </w:t>
+      </w:r>
+      <w:r>
+        <w:rPr>
+          <w:rFonts w:ascii="Courier New" w:cs="Courier New" w:eastAsia="Courier New" w:hAnsi="Courier New"/>
+          <w:sz w:val="18"/>
+          <w:szCs w:val="18"/>
+        </w:rPr>
+        <w:t xml:space="preserve">Laboratorio01_Grupo3.sql</w:t>
+      </w:r>
+      <w:r>
+        <w:rPr>
+          <w:rFonts w:ascii="Times New Roman" w:cs="Times New Roman" w:eastAsia="Times New Roman" w:hAnsi="Times New Roman"/>
+          <w:sz w:val="20"/>
+          <w:szCs w:val="20"/>
+        </w:rPr>
+        <w:t xml:space="preserve">, disponível no repositório do grupo, recria o banco </w:t>
+      </w:r>
+      <w:r>
+        <w:rPr>
+          <w:rFonts w:ascii="Courier New" w:cs="Courier New" w:eastAsia="Courier New" w:hAnsi="Courier New"/>
+          <w:sz w:val="18"/>
+          <w:szCs w:val="18"/>
+        </w:rPr>
+        <w:t xml:space="preserve">locadora</w:t>
+      </w:r>
+      <w:r>
+        <w:rPr>
+          <w:rFonts w:ascii="Times New Roman" w:cs="Times New Roman" w:eastAsia="Times New Roman" w:hAnsi="Times New Roman"/>
+          <w:sz w:val="20"/>
+          <w:szCs w:val="20"/>
+        </w:rPr>
+        <w:t xml:space="preserve"> do zero e é autossuficiente. Ele cria as sete tabelas do modelo lógico no motor InnoDB, com conjunto de caracteres </w:t>
+      </w:r>
+      <w:r>
+        <w:rPr>
+          <w:rFonts w:ascii="Courier New" w:cs="Courier New" w:eastAsia="Courier New" w:hAnsi="Courier New"/>
+          <w:sz w:val="18"/>
+          <w:szCs w:val="18"/>
+        </w:rPr>
+        <w:t xml:space="preserve">utf8mb4</w:t>
+      </w:r>
+      <w:r>
+        <w:rPr>
+          <w:rFonts w:ascii="Times New Roman" w:cs="Times New Roman" w:eastAsia="Times New Roman" w:hAnsi="Times New Roman"/>
+          <w:sz w:val="20"/>
+          <w:szCs w:val="20"/>
+        </w:rPr>
+        <w:t xml:space="preserve">, somando 7 chaves primárias, 8 chaves estrangeiras, 8 restrições de unicidade e 21 restrições </w:t>
+      </w:r>
+      <w:r>
+        <w:rPr>
+          <w:rFonts w:ascii="Courier New" w:cs="Courier New" w:eastAsia="Courier New" w:hAnsi="Courier New"/>
+          <w:sz w:val="18"/>
+          <w:szCs w:val="18"/>
+        </w:rPr>
+        <w:t xml:space="preserve">CHECK</w:t>
+      </w:r>
+      <w:r>
+        <w:rPr>
+          <w:rFonts w:ascii="Times New Roman" w:cs="Times New Roman" w:eastAsia="Times New Roman" w:hAnsi="Times New Roman"/>
+          <w:sz w:val="20"/>
+          <w:szCs w:val="20"/>
+        </w:rPr>
+        <w:t xml:space="preserve">. As restrições </w:t>
+      </w:r>
+      <w:r>
+        <w:rPr>
+          <w:rFonts w:ascii="Courier New" w:cs="Courier New" w:eastAsia="Courier New" w:hAnsi="Courier New"/>
+          <w:sz w:val="18"/>
+          <w:szCs w:val="18"/>
+        </w:rPr>
+        <w:t xml:space="preserve">CHECK</w:t>
+      </w:r>
+      <w:r>
+        <w:rPr>
+          <w:rFonts w:ascii="Times New Roman" w:cs="Times New Roman" w:eastAsia="Times New Roman" w:hAnsi="Times New Roman"/>
+          <w:sz w:val="20"/>
+          <w:szCs w:val="20"/>
+        </w:rPr>
+        <w:t xml:space="preserve"> implementam os domínios controlados definidos na Seção III, como o conjunto fechado de valores de </w:t>
+      </w:r>
+      <w:r>
+        <w:rPr>
+          <w:rFonts w:ascii="Courier New" w:cs="Courier New" w:eastAsia="Courier New" w:hAnsi="Courier New"/>
+          <w:sz w:val="18"/>
+          <w:szCs w:val="18"/>
+        </w:rPr>
+        <w:t xml:space="preserve">status</w:t>
+      </w:r>
+      <w:r>
+        <w:rPr>
+          <w:rFonts w:ascii="Times New Roman" w:cs="Times New Roman" w:eastAsia="Times New Roman" w:hAnsi="Times New Roman"/>
+          <w:sz w:val="20"/>
+          <w:szCs w:val="20"/>
+        </w:rPr>
+        <w:t xml:space="preserve"> e a exigência de quilometragem não negativa, de modo que a regra fica no banco e não depende da aplicação.</w:t>
       </w:r>
     </w:p>
     <w:p>
       <w:pPr>
         <w:spacing w:after="0" w:line="240"/>
-        <w:ind w:left="360" w:hanging="200"/>
+        <w:ind w:firstLine="288"/>
         <w:jc w:val="both"/>
       </w:pPr>
       <w:r>
@@ -16689,7 +16893,15 @@
           <w:sz w:val="20"/>
           <w:szCs w:val="20"/>
         </w:rPr>
-        <w:t xml:space="preserve">1) </w:t>
+        <w:t xml:space="preserve">A carga insere 5 categorias, 5 filiais, 6 clientes, 30 veículos distribuídos em 6 por categoria, 30 registros documentais, 17 locações e 9 manutenções, acima do mínimo de cinco registros por tabela exigido pelo enunciado. Os dados foram construídos para que as seis consultas devolvam resultados não vazios e coerentes entre si: nenhum veículo possui duas locações sobrepostas no tempo, a quilometragem cresce de forma monotônica ao longo das locações de um mesmo veículo, o </w:t>
+      </w:r>
+      <w:r>
+        <w:rPr>
+          <w:rFonts w:ascii="Courier New" w:cs="Courier New" w:eastAsia="Courier New" w:hAnsi="Courier New"/>
+          <w:sz w:val="18"/>
+          <w:szCs w:val="18"/>
+        </w:rPr>
+        <w:t xml:space="preserve">status</w:t>
       </w:r>
       <w:r>
         <w:rPr>
@@ -16697,7 +16909,7 @@
           <w:sz w:val="20"/>
           <w:szCs w:val="20"/>
         </w:rPr>
-        <w:t xml:space="preserve">Locações em aberto, identificadas por </w:t>
+        <w:t xml:space="preserve"> de cada veículo corresponde às locações em aberto e às manutenções em andamento, e o </w:t>
       </w:r>
       <w:r>
         <w:rPr>
@@ -16705,7 +16917,7 @@
           <w:sz w:val="18"/>
           <w:szCs w:val="18"/>
         </w:rPr>
-        <w:t xml:space="preserve">data_real_devolucao IS NULL</w:t>
+        <w:t xml:space="preserve">valor_total</w:t>
       </w:r>
       <w:r>
         <w:rPr>
@@ -16713,13 +16925,29 @@
           <w:sz w:val="20"/>
           <w:szCs w:val="20"/>
         </w:rPr>
-        <w:t xml:space="preserve">.</w:t>
+        <w:t xml:space="preserve"> de cada contrato encerrado equivale ao número de diárias multiplicado pela diária contratada.</w:t>
+      </w:r>
+    </w:p>
+    <w:p>
+      <w:pPr>
+        <w:spacing w:after="60" w:before="120"/>
+        <w:jc w:val="left"/>
+      </w:pPr>
+      <w:r>
+        <w:rPr>
+          <w:rFonts w:ascii="Times New Roman" w:cs="Times New Roman" w:eastAsia="Times New Roman" w:hAnsi="Times New Roman"/>
+          <w:i/>
+          <w:iCs/>
+          <w:sz w:val="20"/>
+          <w:szCs w:val="20"/>
+        </w:rPr>
+        <w:t xml:space="preserve">B. Consultas obrigatórias</w:t>
       </w:r>
     </w:p>
     <w:p>
       <w:pPr>
         <w:spacing w:after="0" w:line="240"/>
-        <w:ind w:left="360" w:hanging="200"/>
+        <w:ind w:firstLine="288"/>
         <w:jc w:val="both"/>
       </w:pPr>
       <w:r>
@@ -16728,7 +16956,15 @@
           <w:sz w:val="20"/>
           <w:szCs w:val="20"/>
         </w:rPr>
-        <w:t xml:space="preserve">2) </w:t>
+        <w:t xml:space="preserve">As seis consultas e os respectivos resultados de execução são apresentados a seguir. O ambiente é o MySQL 8.0.46 com o </w:t>
+      </w:r>
+      <w:r>
+        <w:rPr>
+          <w:rFonts w:ascii="Courier New" w:cs="Courier New" w:eastAsia="Courier New" w:hAnsi="Courier New"/>
+          <w:sz w:val="18"/>
+          <w:szCs w:val="18"/>
+        </w:rPr>
+        <w:t xml:space="preserve">sql_mode</w:t>
       </w:r>
       <w:r>
         <w:rPr>
@@ -16736,13 +16972,73 @@
           <w:sz w:val="20"/>
           <w:szCs w:val="20"/>
         </w:rPr>
-        <w:t xml:space="preserve">Veículos disponíveis agrupados por categoria.</w:t>
+        <w:t xml:space="preserve"> padrão da instalação, que inclui </w:t>
+      </w:r>
+      <w:r>
+        <w:rPr>
+          <w:rFonts w:ascii="Courier New" w:cs="Courier New" w:eastAsia="Courier New" w:hAnsi="Courier New"/>
+          <w:sz w:val="18"/>
+          <w:szCs w:val="18"/>
+        </w:rPr>
+        <w:t xml:space="preserve">ONLY_FULL_GROUP_BY</w:t>
+      </w:r>
+      <w:r>
+        <w:rPr>
+          <w:rFonts w:ascii="Times New Roman" w:cs="Times New Roman" w:eastAsia="Times New Roman" w:hAnsi="Times New Roman"/>
+          <w:sz w:val="20"/>
+          <w:szCs w:val="20"/>
+        </w:rPr>
+        <w:t xml:space="preserve"> e, portanto, exige que toda coluna não agregada apareça na cláusula </w:t>
+      </w:r>
+      <w:r>
+        <w:rPr>
+          <w:rFonts w:ascii="Courier New" w:cs="Courier New" w:eastAsia="Courier New" w:hAnsi="Courier New"/>
+          <w:sz w:val="18"/>
+          <w:szCs w:val="18"/>
+        </w:rPr>
+        <w:t xml:space="preserve">GROUP BY</w:t>
+      </w:r>
+      <w:r>
+        <w:rPr>
+          <w:rFonts w:ascii="Times New Roman" w:cs="Times New Roman" w:eastAsia="Times New Roman" w:hAnsi="Times New Roman"/>
+          <w:sz w:val="20"/>
+          <w:szCs w:val="20"/>
+        </w:rPr>
+        <w:t xml:space="preserve">.</w:t>
       </w:r>
     </w:p>
     <w:p>
       <w:pPr>
-        <w:spacing w:after="0" w:line="240"/>
-        <w:ind w:left="360" w:hanging="200"/>
+        <w:sectPr>
+          <w:type w:val="continuous"/>
+          <w:pgSz w:w="11906" w:h="16838" w:orient="portrait"/>
+          <w:pgMar w:top="1080" w:right="900" w:bottom="1440" w:left="900" w:header="708" w:footer="708" w:gutter="0"/>
+          <w:pgNumType/>
+          <w:cols w:space="360" w:num="2" w:equalWidth="true"/>
+          <w:docGrid w:linePitch="360"/>
+        </w:sectPr>
+      </w:pPr>
+    </w:p>
+    <w:p>
+      <w:pPr>
+        <w:spacing w:after="0" w:before="60"/>
+        <w:ind w:firstLine="288"/>
+        <w:jc w:val="both"/>
+      </w:pPr>
+      <w:r>
+        <w:rPr>
+          <w:rFonts w:ascii="Times New Roman" w:cs="Times New Roman" w:eastAsia="Times New Roman" w:hAnsi="Times New Roman"/>
+          <w:i/>
+          <w:iCs/>
+          <w:sz w:val="20"/>
+          <w:szCs w:val="20"/>
+        </w:rPr>
+        <w:t xml:space="preserve">1) Locações em aberto: </w:t>
+      </w:r>
+    </w:p>
+    <w:p>
+      <w:pPr>
+        <w:spacing w:after="60" w:line="240"/>
         <w:jc w:val="both"/>
       </w:pPr>
       <w:r>
@@ -16751,7 +17047,15 @@
           <w:sz w:val="20"/>
           <w:szCs w:val="20"/>
         </w:rPr>
-        <w:t xml:space="preserve">3) </w:t>
+        <w:t xml:space="preserve">Identifica os contratos ainda não encerrados pelo predicado </w:t>
+      </w:r>
+      <w:r>
+        <w:rPr>
+          <w:rFonts w:ascii="Courier New" w:cs="Courier New" w:eastAsia="Courier New" w:hAnsi="Courier New"/>
+          <w:sz w:val="18"/>
+          <w:szCs w:val="18"/>
+        </w:rPr>
+        <w:t xml:space="preserve">data_real_devolucao IS NULL</w:t>
       </w:r>
       <w:r>
         <w:rPr>
@@ -16759,13 +17063,333 @@
           <w:sz w:val="20"/>
           <w:szCs w:val="20"/>
         </w:rPr>
-        <w:t xml:space="preserve">Cliente com maior número de locações, com COUNT e GROUP BY.</w:t>
+        <w:t xml:space="preserve">, que é o critério definido no dicionário de dados. A consulta exercita quatro junções, sendo duas sobre a mesma tabela FILIAL, com apelidos distintos para a filial de retirada e para a filial de devolução prevista. É essa dupla junção que torna visível, na prática, a decisão de modelagem de usar duas chaves estrangeiras independentes para FILIAL.</w:t>
+      </w:r>
+    </w:p>
+    <w:tbl>
+      <w:tblPr>
+        <w:tblW w:type="dxa" w:w="10106"/>
+        <w:tblBorders>
+          <w:top w:val="single" w:color="auto" w:sz="4"/>
+          <w:left w:val="single" w:color="auto" w:sz="4"/>
+          <w:bottom w:val="single" w:color="auto" w:sz="4"/>
+          <w:right w:val="single" w:color="auto" w:sz="4"/>
+          <w:insideH w:val="single" w:color="auto" w:sz="4"/>
+          <w:insideV w:val="single" w:color="auto" w:sz="4"/>
+        </w:tblBorders>
+      </w:tblPr>
+      <w:tblGrid>
+        <w:gridCol w:w="10106"/>
+      </w:tblGrid>
+      <w:tr>
+        <w:tc>
+          <w:tcPr>
+            <w:tcW w:type="dxa" w:w="10106"/>
+            <w:tcMar>
+              <w:top w:type="dxa" w:w="80"/>
+              <w:left w:type="dxa" w:w="100"/>
+              <w:bottom w:type="dxa" w:w="80"/>
+              <w:right w:type="dxa" w:w="100"/>
+            </w:tcMar>
+          </w:tcPr>
+          <w:p>
+            <w:pPr>
+              <w:spacing w:after="0" w:line="220"/>
+            </w:pPr>
+            <w:r>
+              <w:rPr>
+                <w:rFonts w:ascii="Courier New" w:cs="Courier New" w:eastAsia="Courier New" w:hAnsi="Courier New"/>
+                <w:sz w:val="15"/>
+                <w:szCs w:val="15"/>
+              </w:rPr>
+              <w:t xml:space="preserve">SELECT l.id_locacao,</w:t>
+            </w:r>
+          </w:p>
+          <w:p>
+            <w:pPr>
+              <w:spacing w:after="0" w:line="220"/>
+            </w:pPr>
+            <w:r>
+              <w:rPr>
+                <w:rFonts w:ascii="Courier New" w:cs="Courier New" w:eastAsia="Courier New" w:hAnsi="Courier New"/>
+                <w:sz w:val="15"/>
+                <w:szCs w:val="15"/>
+              </w:rPr>
+              <w:t xml:space="preserve">       c.nome                                AS cliente,</w:t>
+            </w:r>
+          </w:p>
+          <w:p>
+            <w:pPr>
+              <w:spacing w:after="0" w:line="220"/>
+            </w:pPr>
+            <w:r>
+              <w:rPr>
+                <w:rFonts w:ascii="Courier New" w:cs="Courier New" w:eastAsia="Courier New" w:hAnsi="Courier New"/>
+                <w:sz w:val="15"/>
+                <w:szCs w:val="15"/>
+              </w:rPr>
+              <w:t xml:space="preserve">       v.placa,</w:t>
+            </w:r>
+          </w:p>
+          <w:p>
+            <w:pPr>
+              <w:spacing w:after="0" w:line="220"/>
+            </w:pPr>
+            <w:r>
+              <w:rPr>
+                <w:rFonts w:ascii="Courier New" w:cs="Courier New" w:eastAsia="Courier New" w:hAnsi="Courier New"/>
+                <w:sz w:val="15"/>
+                <w:szCs w:val="15"/>
+              </w:rPr>
+              <w:t xml:space="preserve">       CONCAT(v.marca, ' ', v.modelo)        AS veiculo,</w:t>
+            </w:r>
+          </w:p>
+          <w:p>
+            <w:pPr>
+              <w:spacing w:after="0" w:line="220"/>
+            </w:pPr>
+            <w:r>
+              <w:rPr>
+                <w:rFonts w:ascii="Courier New" w:cs="Courier New" w:eastAsia="Courier New" w:hAnsi="Courier New"/>
+                <w:sz w:val="15"/>
+                <w:szCs w:val="15"/>
+              </w:rPr>
+              <w:t xml:space="preserve">       fr.nome                               AS filial_retirada,</w:t>
+            </w:r>
+          </w:p>
+          <w:p>
+            <w:pPr>
+              <w:spacing w:after="0" w:line="220"/>
+            </w:pPr>
+            <w:r>
+              <w:rPr>
+                <w:rFonts w:ascii="Courier New" w:cs="Courier New" w:eastAsia="Courier New" w:hAnsi="Courier New"/>
+                <w:sz w:val="15"/>
+                <w:szCs w:val="15"/>
+              </w:rPr>
+              <w:t xml:space="preserve">       fd.nome                               AS filial_devolucao_prevista,</w:t>
+            </w:r>
+          </w:p>
+          <w:p>
+            <w:pPr>
+              <w:spacing w:after="0" w:line="220"/>
+            </w:pPr>
+            <w:r>
+              <w:rPr>
+                <w:rFonts w:ascii="Courier New" w:cs="Courier New" w:eastAsia="Courier New" w:hAnsi="Courier New"/>
+                <w:sz w:val="15"/>
+                <w:szCs w:val="15"/>
+              </w:rPr>
+              <w:t xml:space="preserve">       l.data_retirada,</w:t>
+            </w:r>
+          </w:p>
+          <w:p>
+            <w:pPr>
+              <w:spacing w:after="0" w:line="220"/>
+            </w:pPr>
+            <w:r>
+              <w:rPr>
+                <w:rFonts w:ascii="Courier New" w:cs="Courier New" w:eastAsia="Courier New" w:hAnsi="Courier New"/>
+                <w:sz w:val="15"/>
+                <w:szCs w:val="15"/>
+              </w:rPr>
+              <w:t xml:space="preserve">       l.data_prevista_devolucao</w:t>
+            </w:r>
+          </w:p>
+          <w:p>
+            <w:pPr>
+              <w:spacing w:after="0" w:line="220"/>
+            </w:pPr>
+            <w:r>
+              <w:rPr>
+                <w:rFonts w:ascii="Courier New" w:cs="Courier New" w:eastAsia="Courier New" w:hAnsi="Courier New"/>
+                <w:sz w:val="15"/>
+                <w:szCs w:val="15"/>
+              </w:rPr>
+              <w:t xml:space="preserve">FROM locacao l</w:t>
+            </w:r>
+          </w:p>
+          <w:p>
+            <w:pPr>
+              <w:spacing w:after="0" w:line="220"/>
+            </w:pPr>
+            <w:r>
+              <w:rPr>
+                <w:rFonts w:ascii="Courier New" w:cs="Courier New" w:eastAsia="Courier New" w:hAnsi="Courier New"/>
+                <w:sz w:val="15"/>
+                <w:szCs w:val="15"/>
+              </w:rPr>
+              <w:t xml:space="preserve">JOIN cliente c  ON c.id_cliente = l.id_cliente</w:t>
+            </w:r>
+          </w:p>
+          <w:p>
+            <w:pPr>
+              <w:spacing w:after="0" w:line="220"/>
+            </w:pPr>
+            <w:r>
+              <w:rPr>
+                <w:rFonts w:ascii="Courier New" w:cs="Courier New" w:eastAsia="Courier New" w:hAnsi="Courier New"/>
+                <w:sz w:val="15"/>
+                <w:szCs w:val="15"/>
+              </w:rPr>
+              <w:t xml:space="preserve">JOIN veiculo v  ON v.id_veiculo = l.id_veiculo</w:t>
+            </w:r>
+          </w:p>
+          <w:p>
+            <w:pPr>
+              <w:spacing w:after="0" w:line="220"/>
+            </w:pPr>
+            <w:r>
+              <w:rPr>
+                <w:rFonts w:ascii="Courier New" w:cs="Courier New" w:eastAsia="Courier New" w:hAnsi="Courier New"/>
+                <w:sz w:val="15"/>
+                <w:szCs w:val="15"/>
+              </w:rPr>
+              <w:t xml:space="preserve">JOIN filial  fr ON fr.id_filial = l.id_filial_retirada</w:t>
+            </w:r>
+          </w:p>
+          <w:p>
+            <w:pPr>
+              <w:spacing w:after="0" w:line="220"/>
+            </w:pPr>
+            <w:r>
+              <w:rPr>
+                <w:rFonts w:ascii="Courier New" w:cs="Courier New" w:eastAsia="Courier New" w:hAnsi="Courier New"/>
+                <w:sz w:val="15"/>
+                <w:szCs w:val="15"/>
+              </w:rPr>
+              <w:t xml:space="preserve">JOIN filial  fd ON fd.id_filial = l.id_filial_devolucao</w:t>
+            </w:r>
+          </w:p>
+          <w:p>
+            <w:pPr>
+              <w:spacing w:after="0" w:line="220"/>
+            </w:pPr>
+            <w:r>
+              <w:rPr>
+                <w:rFonts w:ascii="Courier New" w:cs="Courier New" w:eastAsia="Courier New" w:hAnsi="Courier New"/>
+                <w:sz w:val="15"/>
+                <w:szCs w:val="15"/>
+              </w:rPr>
+              <w:t xml:space="preserve">WHERE l.data_real_devolucao IS NULL</w:t>
+            </w:r>
+          </w:p>
+          <w:p>
+            <w:pPr>
+              <w:spacing w:after="0" w:line="220"/>
+            </w:pPr>
+            <w:r>
+              <w:rPr>
+                <w:rFonts w:ascii="Courier New" w:cs="Courier New" w:eastAsia="Courier New" w:hAnsi="Courier New"/>
+                <w:sz w:val="15"/>
+                <w:szCs w:val="15"/>
+              </w:rPr>
+              <w:t xml:space="preserve">ORDER BY l.data_prevista_devolucao;</w:t>
+            </w:r>
+          </w:p>
+        </w:tc>
+      </w:tr>
+    </w:tbl>
+    <w:p>
+      <w:pPr>
+        <w:spacing w:after="0" w:before="120"/>
+        <w:jc w:val="center"/>
+      </w:pPr>
+      <w:r>
+        <w:drawing>
+          <wp:inline distT="0" distB="0" distL="0" distR="0">
+            <wp:extent cx="6286500" cy="962025"/>
+            <wp:effectExtent t="0" r="0" b="0" l="0"/>
+            <wp:docPr id="1" name="" descr="" title=""/>
+            <wp:cNvGraphicFramePr>
+              <a:graphicFrameLocks xmlns:a="http://schemas.openxmlformats.org/drawingml/2006/main" noChangeAspect="1"/>
+            </wp:cNvGraphicFramePr>
+            <a:graphic xmlns:a="http://schemas.openxmlformats.org/drawingml/2006/main">
+              <a:graphicData uri="http://schemas.openxmlformats.org/drawingml/2006/picture">
+                <pic:pic xmlns:pic="http://schemas.openxmlformats.org/drawingml/2006/picture">
+                  <pic:nvPicPr>
+                    <pic:cNvPr id="0" name="" descr=""/>
+                    <pic:cNvPicPr>
+                      <a:picLocks noChangeAspect="1" noChangeArrowheads="1"/>
+                    </pic:cNvPicPr>
+                  </pic:nvPicPr>
+                  <pic:blipFill>
+                    <a:blip r:embed="rId9" cstate="none"/>
+                    <a:srcRect/>
+                    <a:stretch>
+                      <a:fillRect/>
+                    </a:stretch>
+                  </pic:blipFill>
+                  <pic:spPr bwMode="auto">
+                    <a:xfrm>
+                      <a:off x="0" y="0"/>
+                      <a:ext cx="6286500" cy="962025"/>
+                    </a:xfrm>
+                    <a:prstGeom prst="rect">
+                      <a:avLst/>
+                    </a:prstGeom>
+                  </pic:spPr>
+                </pic:pic>
+              </a:graphicData>
+            </a:graphic>
+          </wp:inline>
+        </w:drawing>
       </w:r>
     </w:p>
     <w:p>
       <w:pPr>
-        <w:spacing w:after="0" w:line="240"/>
-        <w:ind w:left="360" w:hanging="200"/>
+        <w:spacing w:after="120" w:before="120"/>
+        <w:jc w:val="both"/>
+      </w:pPr>
+      <w:r>
+        <w:rPr>
+          <w:rFonts w:ascii="Times New Roman" w:cs="Times New Roman" w:eastAsia="Times New Roman" w:hAnsi="Times New Roman"/>
+          <w:sz w:val="16"/>
+          <w:szCs w:val="16"/>
+        </w:rPr>
+        <w:t xml:space="preserve">Figura 3.  </w:t>
+      </w:r>
+      <w:r>
+        <w:rPr>
+          <w:rFonts w:ascii="Times New Roman" w:cs="Times New Roman" w:eastAsia="Times New Roman" w:hAnsi="Times New Roman"/>
+          <w:sz w:val="16"/>
+          <w:szCs w:val="16"/>
+        </w:rPr>
+        <w:t xml:space="preserve">Resultado da consulta 1. Sete locações em aberto, ordenadas pela data prevista de devolução.</w:t>
+      </w:r>
+    </w:p>
+    <w:p>
+      <w:pPr>
+        <w:sectPr>
+          <w:type w:val="continuous"/>
+          <w:pgSz w:w="11906" w:h="16838" w:orient="portrait"/>
+          <w:pgMar w:top="1080" w:right="900" w:bottom="1440" w:left="900" w:header="708" w:footer="708" w:gutter="0"/>
+          <w:pgNumType/>
+          <w:cols w:num="1"/>
+          <w:docGrid w:linePitch="360"/>
+        </w:sectPr>
+      </w:pPr>
+    </w:p>
+    <w:p>
+      <w:pPr>
+        <w:spacing w:after="0" w:before="60"/>
+        <w:ind w:firstLine="288"/>
+        <w:jc w:val="both"/>
+      </w:pPr>
+      <w:r>
+        <w:rPr>
+          <w:rFonts w:ascii="Times New Roman" w:cs="Times New Roman" w:eastAsia="Times New Roman" w:hAnsi="Times New Roman"/>
+          <w:i/>
+          <w:iCs/>
+          <w:sz w:val="20"/>
+          <w:szCs w:val="20"/>
+        </w:rPr>
+        <w:t xml:space="preserve">2) Veículos disponíveis por categoria: </w:t>
+      </w:r>
+    </w:p>
+    <w:p>
+      <w:pPr>
+        <w:spacing w:after="60" w:line="240"/>
         <w:jc w:val="both"/>
       </w:pPr>
       <w:r>
@@ -16774,7 +17398,15 @@
           <w:sz w:val="20"/>
           <w:szCs w:val="20"/>
         </w:rPr>
-        <w:t xml:space="preserve">4) </w:t>
+        <w:t xml:space="preserve">Agrupa a frota disponível por categoria e concatena as placas com </w:t>
+      </w:r>
+      <w:r>
+        <w:rPr>
+          <w:rFonts w:ascii="Courier New" w:cs="Courier New" w:eastAsia="Courier New" w:hAnsi="Courier New"/>
+          <w:sz w:val="18"/>
+          <w:szCs w:val="18"/>
+        </w:rPr>
+        <w:t xml:space="preserve">GROUP_CONCAT</w:t>
       </w:r>
       <w:r>
         <w:rPr>
@@ -16782,13 +17414,348 @@
           <w:sz w:val="20"/>
           <w:szCs w:val="20"/>
         </w:rPr>
-        <w:t xml:space="preserve">Faturamento total por filial, com SUM, JOIN e GROUP BY.</w:t>
+        <w:t xml:space="preserve">. O </w:t>
+      </w:r>
+      <w:r>
+        <w:rPr>
+          <w:rFonts w:ascii="Courier New" w:cs="Courier New" w:eastAsia="Courier New" w:hAnsi="Courier New"/>
+          <w:sz w:val="18"/>
+          <w:szCs w:val="18"/>
+        </w:rPr>
+        <w:t xml:space="preserve">LEFT JOIN</w:t>
+      </w:r>
+      <w:r>
+        <w:rPr>
+          <w:rFonts w:ascii="Times New Roman" w:cs="Times New Roman" w:eastAsia="Times New Roman" w:hAnsi="Times New Roman"/>
+          <w:sz w:val="20"/>
+          <w:szCs w:val="20"/>
+        </w:rPr>
+        <w:t xml:space="preserve"> é deliberado: ele mantém na saída as categorias que estão sem nenhum veículo disponível, o que um </w:t>
+      </w:r>
+      <w:r>
+        <w:rPr>
+          <w:rFonts w:ascii="Courier New" w:cs="Courier New" w:eastAsia="Courier New" w:hAnsi="Courier New"/>
+          <w:sz w:val="18"/>
+          <w:szCs w:val="18"/>
+        </w:rPr>
+        <w:t xml:space="preserve">INNER JOIN</w:t>
+      </w:r>
+      <w:r>
+        <w:rPr>
+          <w:rFonts w:ascii="Times New Roman" w:cs="Times New Roman" w:eastAsia="Times New Roman" w:hAnsi="Times New Roman"/>
+          <w:sz w:val="20"/>
+          <w:szCs w:val="20"/>
+        </w:rPr>
+        <w:t xml:space="preserve"> esconderia. O filtro </w:t>
+      </w:r>
+      <w:r>
+        <w:rPr>
+          <w:rFonts w:ascii="Courier New" w:cs="Courier New" w:eastAsia="Courier New" w:hAnsi="Courier New"/>
+          <w:sz w:val="18"/>
+          <w:szCs w:val="18"/>
+        </w:rPr>
+        <w:t xml:space="preserve">status = 'DISPONIVEL'</w:t>
+      </w:r>
+      <w:r>
+        <w:rPr>
+          <w:rFonts w:ascii="Times New Roman" w:cs="Times New Roman" w:eastAsia="Times New Roman" w:hAnsi="Times New Roman"/>
+          <w:sz w:val="20"/>
+          <w:szCs w:val="20"/>
+        </w:rPr>
+        <w:t xml:space="preserve"> fica na condição da junção, e não no </w:t>
+      </w:r>
+      <w:r>
+        <w:rPr>
+          <w:rFonts w:ascii="Courier New" w:cs="Courier New" w:eastAsia="Courier New" w:hAnsi="Courier New"/>
+          <w:sz w:val="18"/>
+          <w:szCs w:val="18"/>
+        </w:rPr>
+        <w:t xml:space="preserve">WHERE</w:t>
+      </w:r>
+      <w:r>
+        <w:rPr>
+          <w:rFonts w:ascii="Times New Roman" w:cs="Times New Roman" w:eastAsia="Times New Roman" w:hAnsi="Times New Roman"/>
+          <w:sz w:val="20"/>
+          <w:szCs w:val="20"/>
+        </w:rPr>
+        <w:t xml:space="preserve">, justamente para não anular o efeito do </w:t>
+      </w:r>
+      <w:r>
+        <w:rPr>
+          <w:rFonts w:ascii="Courier New" w:cs="Courier New" w:eastAsia="Courier New" w:hAnsi="Courier New"/>
+          <w:sz w:val="18"/>
+          <w:szCs w:val="18"/>
+        </w:rPr>
+        <w:t xml:space="preserve">LEFT JOIN</w:t>
+      </w:r>
+      <w:r>
+        <w:rPr>
+          <w:rFonts w:ascii="Times New Roman" w:cs="Times New Roman" w:eastAsia="Times New Roman" w:hAnsi="Times New Roman"/>
+          <w:sz w:val="20"/>
+          <w:szCs w:val="20"/>
+        </w:rPr>
+        <w:t xml:space="preserve">.</w:t>
+      </w:r>
+    </w:p>
+    <w:tbl>
+      <w:tblPr>
+        <w:tblW w:type="dxa" w:w="10106"/>
+        <w:tblBorders>
+          <w:top w:val="single" w:color="auto" w:sz="4"/>
+          <w:left w:val="single" w:color="auto" w:sz="4"/>
+          <w:bottom w:val="single" w:color="auto" w:sz="4"/>
+          <w:right w:val="single" w:color="auto" w:sz="4"/>
+          <w:insideH w:val="single" w:color="auto" w:sz="4"/>
+          <w:insideV w:val="single" w:color="auto" w:sz="4"/>
+        </w:tblBorders>
+      </w:tblPr>
+      <w:tblGrid>
+        <w:gridCol w:w="10106"/>
+      </w:tblGrid>
+      <w:tr>
+        <w:tc>
+          <w:tcPr>
+            <w:tcW w:type="dxa" w:w="10106"/>
+            <w:tcMar>
+              <w:top w:type="dxa" w:w="80"/>
+              <w:left w:type="dxa" w:w="100"/>
+              <w:bottom w:type="dxa" w:w="80"/>
+              <w:right w:type="dxa" w:w="100"/>
+            </w:tcMar>
+          </w:tcPr>
+          <w:p>
+            <w:pPr>
+              <w:spacing w:after="0" w:line="220"/>
+            </w:pPr>
+            <w:r>
+              <w:rPr>
+                <w:rFonts w:ascii="Courier New" w:cs="Courier New" w:eastAsia="Courier New" w:hAnsi="Courier New"/>
+                <w:sz w:val="15"/>
+                <w:szCs w:val="15"/>
+              </w:rPr>
+              <w:t xml:space="preserve">SELECT cat.nome                      AS categoria,</w:t>
+            </w:r>
+          </w:p>
+          <w:p>
+            <w:pPr>
+              <w:spacing w:after="0" w:line="220"/>
+            </w:pPr>
+            <w:r>
+              <w:rPr>
+                <w:rFonts w:ascii="Courier New" w:cs="Courier New" w:eastAsia="Courier New" w:hAnsi="Courier New"/>
+                <w:sz w:val="15"/>
+                <w:szCs w:val="15"/>
+              </w:rPr>
+              <w:t xml:space="preserve">       cat.valor_diaria,</w:t>
+            </w:r>
+          </w:p>
+          <w:p>
+            <w:pPr>
+              <w:spacing w:after="0" w:line="220"/>
+            </w:pPr>
+            <w:r>
+              <w:rPr>
+                <w:rFonts w:ascii="Courier New" w:cs="Courier New" w:eastAsia="Courier New" w:hAnsi="Courier New"/>
+                <w:sz w:val="15"/>
+                <w:szCs w:val="15"/>
+              </w:rPr>
+              <w:t xml:space="preserve">       COUNT(v.id_veiculo)           AS veiculos_disponiveis,</w:t>
+            </w:r>
+          </w:p>
+          <w:p>
+            <w:pPr>
+              <w:spacing w:after="0" w:line="220"/>
+            </w:pPr>
+            <w:r>
+              <w:rPr>
+                <w:rFonts w:ascii="Courier New" w:cs="Courier New" w:eastAsia="Courier New" w:hAnsi="Courier New"/>
+                <w:sz w:val="15"/>
+                <w:szCs w:val="15"/>
+              </w:rPr>
+              <w:t xml:space="preserve">       GROUP_CONCAT(CONCAT(v.marca, ' ', v.modelo, ' (', v.placa, ')')</w:t>
+            </w:r>
+          </w:p>
+          <w:p>
+            <w:pPr>
+              <w:spacing w:after="0" w:line="220"/>
+            </w:pPr>
+            <w:r>
+              <w:rPr>
+                <w:rFonts w:ascii="Courier New" w:cs="Courier New" w:eastAsia="Courier New" w:hAnsi="Courier New"/>
+                <w:sz w:val="15"/>
+                <w:szCs w:val="15"/>
+              </w:rPr>
+              <w:t xml:space="preserve">                    ORDER BY v.placa SEPARATOR ' | ') AS frota_disponivel</w:t>
+            </w:r>
+          </w:p>
+          <w:p>
+            <w:pPr>
+              <w:spacing w:after="0" w:line="220"/>
+            </w:pPr>
+            <w:r>
+              <w:rPr>
+                <w:rFonts w:ascii="Courier New" w:cs="Courier New" w:eastAsia="Courier New" w:hAnsi="Courier New"/>
+                <w:sz w:val="15"/>
+                <w:szCs w:val="15"/>
+              </w:rPr>
+              <w:t xml:space="preserve">FROM categoria cat</w:t>
+            </w:r>
+          </w:p>
+          <w:p>
+            <w:pPr>
+              <w:spacing w:after="0" w:line="220"/>
+            </w:pPr>
+            <w:r>
+              <w:rPr>
+                <w:rFonts w:ascii="Courier New" w:cs="Courier New" w:eastAsia="Courier New" w:hAnsi="Courier New"/>
+                <w:sz w:val="15"/>
+                <w:szCs w:val="15"/>
+              </w:rPr>
+              <w:t xml:space="preserve">LEFT JOIN veiculo v ON v.id_categoria = cat.id_categoria</w:t>
+            </w:r>
+          </w:p>
+          <w:p>
+            <w:pPr>
+              <w:spacing w:after="0" w:line="220"/>
+            </w:pPr>
+            <w:r>
+              <w:rPr>
+                <w:rFonts w:ascii="Courier New" w:cs="Courier New" w:eastAsia="Courier New" w:hAnsi="Courier New"/>
+                <w:sz w:val="15"/>
+                <w:szCs w:val="15"/>
+              </w:rPr>
+              <w:t xml:space="preserve">                   AND v.status = 'DISPONIVEL'</w:t>
+            </w:r>
+          </w:p>
+          <w:p>
+            <w:pPr>
+              <w:spacing w:after="0" w:line="220"/>
+            </w:pPr>
+            <w:r>
+              <w:rPr>
+                <w:rFonts w:ascii="Courier New" w:cs="Courier New" w:eastAsia="Courier New" w:hAnsi="Courier New"/>
+                <w:sz w:val="15"/>
+                <w:szCs w:val="15"/>
+              </w:rPr>
+              <w:t xml:space="preserve">GROUP BY cat.id_categoria, cat.nome, cat.valor_diaria</w:t>
+            </w:r>
+          </w:p>
+          <w:p>
+            <w:pPr>
+              <w:spacing w:after="0" w:line="220"/>
+            </w:pPr>
+            <w:r>
+              <w:rPr>
+                <w:rFonts w:ascii="Courier New" w:cs="Courier New" w:eastAsia="Courier New" w:hAnsi="Courier New"/>
+                <w:sz w:val="15"/>
+                <w:szCs w:val="15"/>
+              </w:rPr>
+              <w:t xml:space="preserve">ORDER BY veiculos_disponiveis DESC, cat.nome;</w:t>
+            </w:r>
+          </w:p>
+        </w:tc>
+      </w:tr>
+    </w:tbl>
+    <w:p>
+      <w:pPr>
+        <w:spacing w:after="0" w:before="120"/>
+        <w:jc w:val="center"/>
+      </w:pPr>
+      <w:r>
+        <w:drawing>
+          <wp:inline distT="0" distB="0" distL="0" distR="0">
+            <wp:extent cx="6238875" cy="981075"/>
+            <wp:effectExtent t="0" r="0" b="0" l="0"/>
+            <wp:docPr id="1" name="" descr="" title=""/>
+            <wp:cNvGraphicFramePr>
+              <a:graphicFrameLocks xmlns:a="http://schemas.openxmlformats.org/drawingml/2006/main" noChangeAspect="1"/>
+            </wp:cNvGraphicFramePr>
+            <a:graphic xmlns:a="http://schemas.openxmlformats.org/drawingml/2006/main">
+              <a:graphicData uri="http://schemas.openxmlformats.org/drawingml/2006/picture">
+                <pic:pic xmlns:pic="http://schemas.openxmlformats.org/drawingml/2006/picture">
+                  <pic:nvPicPr>
+                    <pic:cNvPr id="0" name="" descr=""/>
+                    <pic:cNvPicPr>
+                      <a:picLocks noChangeAspect="1" noChangeArrowheads="1"/>
+                    </pic:cNvPicPr>
+                  </pic:nvPicPr>
+                  <pic:blipFill>
+                    <a:blip r:embed="rId10" cstate="none"/>
+                    <a:srcRect/>
+                    <a:stretch>
+                      <a:fillRect/>
+                    </a:stretch>
+                  </pic:blipFill>
+                  <pic:spPr bwMode="auto">
+                    <a:xfrm>
+                      <a:off x="0" y="0"/>
+                      <a:ext cx="6238875" cy="981075"/>
+                    </a:xfrm>
+                    <a:prstGeom prst="rect">
+                      <a:avLst/>
+                    </a:prstGeom>
+                  </pic:spPr>
+                </pic:pic>
+              </a:graphicData>
+            </a:graphic>
+          </wp:inline>
+        </w:drawing>
       </w:r>
     </w:p>
     <w:p>
       <w:pPr>
-        <w:spacing w:after="0" w:line="240"/>
-        <w:ind w:left="360" w:hanging="200"/>
+        <w:spacing w:after="120" w:before="120"/>
+        <w:jc w:val="both"/>
+      </w:pPr>
+      <w:r>
+        <w:rPr>
+          <w:rFonts w:ascii="Times New Roman" w:cs="Times New Roman" w:eastAsia="Times New Roman" w:hAnsi="Times New Roman"/>
+          <w:sz w:val="16"/>
+          <w:szCs w:val="16"/>
+        </w:rPr>
+        <w:t xml:space="preserve">Figura 4.  </w:t>
+      </w:r>
+      <w:r>
+        <w:rPr>
+          <w:rFonts w:ascii="Times New Roman" w:cs="Times New Roman" w:eastAsia="Times New Roman" w:hAnsi="Times New Roman"/>
+          <w:sz w:val="16"/>
+          <w:szCs w:val="16"/>
+        </w:rPr>
+        <w:t xml:space="preserve">Resultado da consulta 2. As cinco categorias com a contagem e a relação dos veículos disponíveis.</w:t>
+      </w:r>
+    </w:p>
+    <w:p>
+      <w:pPr>
+        <w:sectPr>
+          <w:type w:val="continuous"/>
+          <w:pgSz w:w="11906" w:h="16838" w:orient="portrait"/>
+          <w:pgMar w:top="1080" w:right="900" w:bottom="1440" w:left="900" w:header="708" w:footer="708" w:gutter="0"/>
+          <w:pgNumType/>
+          <w:cols w:num="1"/>
+          <w:docGrid w:linePitch="360"/>
+        </w:sectPr>
+      </w:pPr>
+    </w:p>
+    <w:p>
+      <w:pPr>
+        <w:spacing w:after="0" w:before="60"/>
+        <w:ind w:firstLine="288"/>
+        <w:jc w:val="both"/>
+      </w:pPr>
+      <w:r>
+        <w:rPr>
+          <w:rFonts w:ascii="Times New Roman" w:cs="Times New Roman" w:eastAsia="Times New Roman" w:hAnsi="Times New Roman"/>
+          <w:i/>
+          <w:iCs/>
+          <w:sz w:val="20"/>
+          <w:szCs w:val="20"/>
+        </w:rPr>
+        <w:t xml:space="preserve">3) Cliente com maior número de locações: </w:t>
+      </w:r>
+    </w:p>
+    <w:p>
+      <w:pPr>
+        <w:spacing w:after="60" w:line="240"/>
         <w:jc w:val="both"/>
       </w:pPr>
       <w:r>
@@ -16797,7 +17764,15 @@
           <w:sz w:val="20"/>
           <w:szCs w:val="20"/>
         </w:rPr>
-        <w:t xml:space="preserve">5) </w:t>
+        <w:t xml:space="preserve">Aplica </w:t>
+      </w:r>
+      <w:r>
+        <w:rPr>
+          <w:rFonts w:ascii="Courier New" w:cs="Courier New" w:eastAsia="Courier New" w:hAnsi="Courier New"/>
+          <w:sz w:val="18"/>
+          <w:szCs w:val="18"/>
+        </w:rPr>
+        <w:t xml:space="preserve">COUNT</w:t>
       </w:r>
       <w:r>
         <w:rPr>
@@ -16805,7 +17780,7 @@
           <w:sz w:val="20"/>
           <w:szCs w:val="20"/>
         </w:rPr>
-        <w:t xml:space="preserve">Locações com atraso na devolução, por comparação entre </w:t>
+        <w:t xml:space="preserve"> com </w:t>
       </w:r>
       <w:r>
         <w:rPr>
@@ -16813,7 +17788,7 @@
           <w:sz w:val="18"/>
           <w:szCs w:val="18"/>
         </w:rPr>
-        <w:t xml:space="preserve">data_prevista_devolucao</w:t>
+        <w:t xml:space="preserve">GROUP BY</w:t>
       </w:r>
       <w:r>
         <w:rPr>
@@ -16821,7 +17796,7 @@
           <w:sz w:val="20"/>
           <w:szCs w:val="20"/>
         </w:rPr>
-        <w:t xml:space="preserve"> e </w:t>
+        <w:t xml:space="preserve"> sobre a tabela associativa e ordena pelo total. O </w:t>
       </w:r>
       <w:r>
         <w:rPr>
@@ -16829,7 +17804,7 @@
           <w:sz w:val="18"/>
           <w:szCs w:val="18"/>
         </w:rPr>
-        <w:t xml:space="preserve">data_real_devolucao</w:t>
+        <w:t xml:space="preserve">LIMIT 1</w:t>
       </w:r>
       <w:r>
         <w:rPr>
@@ -16837,13 +17812,252 @@
           <w:sz w:val="20"/>
           <w:szCs w:val="20"/>
         </w:rPr>
-        <w:t xml:space="preserve">.</w:t>
-      </w:r>
+        <w:t xml:space="preserve"> devolve apenas o primeiro colocado, como pede o enunciado; sem ele a mesma consulta produz o ranking completo dos clientes. O desempate secundário por nome evita que o resultado dependa da ordem física das linhas.</w:t>
+      </w:r>
+    </w:p>
+    <w:tbl>
+      <w:tblPr>
+        <w:tblW w:type="dxa" w:w="10106"/>
+        <w:tblBorders>
+          <w:top w:val="single" w:color="auto" w:sz="4"/>
+          <w:left w:val="single" w:color="auto" w:sz="4"/>
+          <w:bottom w:val="single" w:color="auto" w:sz="4"/>
+          <w:right w:val="single" w:color="auto" w:sz="4"/>
+          <w:insideH w:val="single" w:color="auto" w:sz="4"/>
+          <w:insideV w:val="single" w:color="auto" w:sz="4"/>
+        </w:tblBorders>
+      </w:tblPr>
+      <w:tblGrid>
+        <w:gridCol w:w="10106"/>
+      </w:tblGrid>
+      <w:tr>
+        <w:tc>
+          <w:tcPr>
+            <w:tcW w:type="dxa" w:w="10106"/>
+            <w:tcMar>
+              <w:top w:type="dxa" w:w="80"/>
+              <w:left w:type="dxa" w:w="100"/>
+              <w:bottom w:type="dxa" w:w="80"/>
+              <w:right w:type="dxa" w:w="100"/>
+            </w:tcMar>
+          </w:tcPr>
+          <w:p>
+            <w:pPr>
+              <w:spacing w:after="0" w:line="220"/>
+            </w:pPr>
+            <w:r>
+              <w:rPr>
+                <w:rFonts w:ascii="Courier New" w:cs="Courier New" w:eastAsia="Courier New" w:hAnsi="Courier New"/>
+                <w:sz w:val="15"/>
+                <w:szCs w:val="15"/>
+              </w:rPr>
+              <w:t xml:space="preserve">SELECT c.nome                 AS cliente,</w:t>
+            </w:r>
+          </w:p>
+          <w:p>
+            <w:pPr>
+              <w:spacing w:after="0" w:line="220"/>
+            </w:pPr>
+            <w:r>
+              <w:rPr>
+                <w:rFonts w:ascii="Courier New" w:cs="Courier New" w:eastAsia="Courier New" w:hAnsi="Courier New"/>
+                <w:sz w:val="15"/>
+                <w:szCs w:val="15"/>
+              </w:rPr>
+              <w:t xml:space="preserve">       c.cpf,</w:t>
+            </w:r>
+          </w:p>
+          <w:p>
+            <w:pPr>
+              <w:spacing w:after="0" w:line="220"/>
+            </w:pPr>
+            <w:r>
+              <w:rPr>
+                <w:rFonts w:ascii="Courier New" w:cs="Courier New" w:eastAsia="Courier New" w:hAnsi="Courier New"/>
+                <w:sz w:val="15"/>
+                <w:szCs w:val="15"/>
+              </w:rPr>
+              <w:t xml:space="preserve">       COUNT(l.id_locacao)    AS total_locacoes</w:t>
+            </w:r>
+          </w:p>
+          <w:p>
+            <w:pPr>
+              <w:spacing w:after="0" w:line="220"/>
+            </w:pPr>
+            <w:r>
+              <w:rPr>
+                <w:rFonts w:ascii="Courier New" w:cs="Courier New" w:eastAsia="Courier New" w:hAnsi="Courier New"/>
+                <w:sz w:val="15"/>
+                <w:szCs w:val="15"/>
+              </w:rPr>
+              <w:t xml:space="preserve">FROM cliente c</w:t>
+            </w:r>
+          </w:p>
+          <w:p>
+            <w:pPr>
+              <w:spacing w:after="0" w:line="220"/>
+            </w:pPr>
+            <w:r>
+              <w:rPr>
+                <w:rFonts w:ascii="Courier New" w:cs="Courier New" w:eastAsia="Courier New" w:hAnsi="Courier New"/>
+                <w:sz w:val="15"/>
+                <w:szCs w:val="15"/>
+              </w:rPr>
+              <w:t xml:space="preserve">JOIN locacao l ON l.id_cliente = c.id_cliente</w:t>
+            </w:r>
+          </w:p>
+          <w:p>
+            <w:pPr>
+              <w:spacing w:after="0" w:line="220"/>
+            </w:pPr>
+            <w:r>
+              <w:rPr>
+                <w:rFonts w:ascii="Courier New" w:cs="Courier New" w:eastAsia="Courier New" w:hAnsi="Courier New"/>
+                <w:sz w:val="15"/>
+                <w:szCs w:val="15"/>
+              </w:rPr>
+              <w:t xml:space="preserve">GROUP BY c.id_cliente, c.nome, c.cpf</w:t>
+            </w:r>
+          </w:p>
+          <w:p>
+            <w:pPr>
+              <w:spacing w:after="0" w:line="220"/>
+            </w:pPr>
+            <w:r>
+              <w:rPr>
+                <w:rFonts w:ascii="Courier New" w:cs="Courier New" w:eastAsia="Courier New" w:hAnsi="Courier New"/>
+                <w:sz w:val="15"/>
+                <w:szCs w:val="15"/>
+              </w:rPr>
+              <w:t xml:space="preserve">ORDER BY total_locacoes DESC, c.nome</w:t>
+            </w:r>
+          </w:p>
+          <w:p>
+            <w:pPr>
+              <w:spacing w:after="0" w:line="220"/>
+            </w:pPr>
+            <w:r>
+              <w:rPr>
+                <w:rFonts w:ascii="Courier New" w:cs="Courier New" w:eastAsia="Courier New" w:hAnsi="Courier New"/>
+                <w:sz w:val="15"/>
+                <w:szCs w:val="15"/>
+              </w:rPr>
+              <w:t xml:space="preserve">LIMIT 1;</w:t>
+            </w:r>
+          </w:p>
+          <w:p>
+            <w:pPr>
+              <w:spacing w:after="80" w:line="220"/>
+            </w:pPr>
+            <w:r>
+              <w:rPr>
+                <w:rFonts w:ascii="Courier New" w:cs="Courier New" w:eastAsia="Courier New" w:hAnsi="Courier New"/>
+                <w:sz w:val="15"/>
+                <w:szCs w:val="15"/>
+              </w:rPr>
+              <w:t xml:space="preserve"/>
+            </w:r>
+          </w:p>
+          <w:p>
+            <w:pPr>
+              <w:spacing w:after="0" w:line="220"/>
+            </w:pPr>
+            <w:r>
+              <w:rPr>
+                <w:rFonts w:ascii="Courier New" w:cs="Courier New" w:eastAsia="Courier New" w:hAnsi="Courier New"/>
+                <w:sz w:val="15"/>
+                <w:szCs w:val="15"/>
+              </w:rPr>
+              <w:t xml:space="preserve">+-------------------------+-------------+----------------+</w:t>
+            </w:r>
+          </w:p>
+          <w:p>
+            <w:pPr>
+              <w:spacing w:after="0" w:line="220"/>
+            </w:pPr>
+            <w:r>
+              <w:rPr>
+                <w:rFonts w:ascii="Courier New" w:cs="Courier New" w:eastAsia="Courier New" w:hAnsi="Courier New"/>
+                <w:sz w:val="15"/>
+                <w:szCs w:val="15"/>
+              </w:rPr>
+              <w:t xml:space="preserve">| cliente                 | cpf         | total_locacoes |</w:t>
+            </w:r>
+          </w:p>
+          <w:p>
+            <w:pPr>
+              <w:spacing w:after="0" w:line="220"/>
+            </w:pPr>
+            <w:r>
+              <w:rPr>
+                <w:rFonts w:ascii="Courier New" w:cs="Courier New" w:eastAsia="Courier New" w:hAnsi="Courier New"/>
+                <w:sz w:val="15"/>
+                <w:szCs w:val="15"/>
+              </w:rPr>
+              <w:t xml:space="preserve">+-------------------------+-------------+----------------+</w:t>
+            </w:r>
+          </w:p>
+          <w:p>
+            <w:pPr>
+              <w:spacing w:after="0" w:line="220"/>
+            </w:pPr>
+            <w:r>
+              <w:rPr>
+                <w:rFonts w:ascii="Courier New" w:cs="Courier New" w:eastAsia="Courier New" w:hAnsi="Courier New"/>
+                <w:sz w:val="15"/>
+                <w:szCs w:val="15"/>
+              </w:rPr>
+              <w:t xml:space="preserve">| Marcos Vinicius Andrade | 07894561203 |              5 |</w:t>
+            </w:r>
+          </w:p>
+          <w:p>
+            <w:pPr>
+              <w:spacing w:after="0" w:line="220"/>
+            </w:pPr>
+            <w:r>
+              <w:rPr>
+                <w:rFonts w:ascii="Courier New" w:cs="Courier New" w:eastAsia="Courier New" w:hAnsi="Courier New"/>
+                <w:sz w:val="15"/>
+                <w:szCs w:val="15"/>
+              </w:rPr>
+              <w:t xml:space="preserve">+-------------------------+-------------+----------------+</w:t>
+            </w:r>
+          </w:p>
+        </w:tc>
+      </w:tr>
+    </w:tbl>
+    <w:p>
+      <w:pPr>
+        <w:sectPr>
+          <w:type w:val="continuous"/>
+          <w:pgSz w:w="11906" w:h="16838" w:orient="portrait"/>
+          <w:pgMar w:top="1080" w:right="900" w:bottom="1440" w:left="900" w:header="708" w:footer="708" w:gutter="0"/>
+          <w:pgNumType/>
+          <w:cols w:num="1"/>
+          <w:docGrid w:linePitch="360"/>
+        </w:sectPr>
+      </w:pPr>
     </w:p>
     <w:p>
       <w:pPr>
-        <w:spacing w:after="0" w:line="240"/>
-        <w:ind w:left="360" w:hanging="200"/>
+        <w:spacing w:after="0" w:before="60"/>
+        <w:ind w:firstLine="288"/>
+        <w:jc w:val="both"/>
+      </w:pPr>
+      <w:r>
+        <w:rPr>
+          <w:rFonts w:ascii="Times New Roman" w:cs="Times New Roman" w:eastAsia="Times New Roman" w:hAnsi="Times New Roman"/>
+          <w:i/>
+          <w:iCs/>
+          <w:sz w:val="20"/>
+          <w:szCs w:val="20"/>
+        </w:rPr>
+        <w:t xml:space="preserve">4) Faturamento por filial: </w:t>
+      </w:r>
+    </w:p>
+    <w:p>
+      <w:pPr>
+        <w:spacing w:after="60" w:line="240"/>
         <w:jc w:val="both"/>
       </w:pPr>
       <w:r>
@@ -16852,7 +18066,15 @@
           <w:sz w:val="20"/>
           <w:szCs w:val="20"/>
         </w:rPr>
-        <w:t xml:space="preserve">6) </w:t>
+        <w:t xml:space="preserve">Soma o </w:t>
+      </w:r>
+      <w:r>
+        <w:rPr>
+          <w:rFonts w:ascii="Courier New" w:cs="Courier New" w:eastAsia="Courier New" w:hAnsi="Courier New"/>
+          <w:sz w:val="18"/>
+          <w:szCs w:val="18"/>
+        </w:rPr>
+        <w:t xml:space="preserve">valor_total</w:t>
       </w:r>
       <w:r>
         <w:rPr>
@@ -16860,7 +18082,7 @@
           <w:sz w:val="20"/>
           <w:szCs w:val="20"/>
         </w:rPr>
-        <w:t xml:space="preserve">Custo total de manutenção por veículo, a partir da tabela </w:t>
+        <w:t xml:space="preserve"> dos contratos encerrados, agrupando pela filial de retirada. O filtro por </w:t>
       </w:r>
       <w:r>
         <w:rPr>
@@ -16868,7 +18090,7 @@
           <w:sz w:val="18"/>
           <w:szCs w:val="18"/>
         </w:rPr>
-        <w:t xml:space="preserve">manutencao</w:t>
+        <w:t xml:space="preserve">status = 'FINALIZADA'</w:t>
       </w:r>
       <w:r>
         <w:rPr>
@@ -16876,12 +18098,805 @@
           <w:sz w:val="20"/>
           <w:szCs w:val="20"/>
         </w:rPr>
-        <w:t xml:space="preserve">.</w:t>
+        <w:t xml:space="preserve"> é necessário porque, no modelo, </w:t>
+      </w:r>
+      <w:r>
+        <w:rPr>
+          <w:rFonts w:ascii="Courier New" w:cs="Courier New" w:eastAsia="Courier New" w:hAnsi="Courier New"/>
+          <w:sz w:val="18"/>
+          <w:szCs w:val="18"/>
+        </w:rPr>
+        <w:t xml:space="preserve">valor_total</w:t>
+      </w:r>
+      <w:r>
+        <w:rPr>
+          <w:rFonts w:ascii="Times New Roman" w:cs="Times New Roman" w:eastAsia="Times New Roman" w:hAnsi="Times New Roman"/>
+          <w:sz w:val="20"/>
+          <w:szCs w:val="20"/>
+        </w:rPr>
+        <w:t xml:space="preserve"> é o valor efetivamente faturado e permanece nulo enquanto a locação está aberta. Incluir contratos cancelados inflaria o faturamento com negócios que não se realizaram.</w:t>
+      </w:r>
+    </w:p>
+    <w:tbl>
+      <w:tblPr>
+        <w:tblW w:type="dxa" w:w="10106"/>
+        <w:tblBorders>
+          <w:top w:val="single" w:color="auto" w:sz="4"/>
+          <w:left w:val="single" w:color="auto" w:sz="4"/>
+          <w:bottom w:val="single" w:color="auto" w:sz="4"/>
+          <w:right w:val="single" w:color="auto" w:sz="4"/>
+          <w:insideH w:val="single" w:color="auto" w:sz="4"/>
+          <w:insideV w:val="single" w:color="auto" w:sz="4"/>
+        </w:tblBorders>
+      </w:tblPr>
+      <w:tblGrid>
+        <w:gridCol w:w="10106"/>
+      </w:tblGrid>
+      <w:tr>
+        <w:tc>
+          <w:tcPr>
+            <w:tcW w:type="dxa" w:w="10106"/>
+            <w:tcMar>
+              <w:top w:type="dxa" w:w="80"/>
+              <w:left w:type="dxa" w:w="100"/>
+              <w:bottom w:type="dxa" w:w="80"/>
+              <w:right w:type="dxa" w:w="100"/>
+            </w:tcMar>
+          </w:tcPr>
+          <w:p>
+            <w:pPr>
+              <w:spacing w:after="0" w:line="220"/>
+            </w:pPr>
+            <w:r>
+              <w:rPr>
+                <w:rFonts w:ascii="Courier New" w:cs="Courier New" w:eastAsia="Courier New" w:hAnsi="Courier New"/>
+                <w:sz w:val="15"/>
+                <w:szCs w:val="15"/>
+              </w:rPr>
+              <w:t xml:space="preserve">SELECT f.nome                  AS filial,</w:t>
+            </w:r>
+          </w:p>
+          <w:p>
+            <w:pPr>
+              <w:spacing w:after="0" w:line="220"/>
+            </w:pPr>
+            <w:r>
+              <w:rPr>
+                <w:rFonts w:ascii="Courier New" w:cs="Courier New" w:eastAsia="Courier New" w:hAnsi="Courier New"/>
+                <w:sz w:val="15"/>
+                <w:szCs w:val="15"/>
+              </w:rPr>
+              <w:t xml:space="preserve">       f.cidade,</w:t>
+            </w:r>
+          </w:p>
+          <w:p>
+            <w:pPr>
+              <w:spacing w:after="0" w:line="220"/>
+            </w:pPr>
+            <w:r>
+              <w:rPr>
+                <w:rFonts w:ascii="Courier New" w:cs="Courier New" w:eastAsia="Courier New" w:hAnsi="Courier New"/>
+                <w:sz w:val="15"/>
+                <w:szCs w:val="15"/>
+              </w:rPr>
+              <w:t xml:space="preserve">       COUNT(l.id_locacao)     AS locacoes_finalizadas,</w:t>
+            </w:r>
+          </w:p>
+          <w:p>
+            <w:pPr>
+              <w:spacing w:after="0" w:line="220"/>
+            </w:pPr>
+            <w:r>
+              <w:rPr>
+                <w:rFonts w:ascii="Courier New" w:cs="Courier New" w:eastAsia="Courier New" w:hAnsi="Courier New"/>
+                <w:sz w:val="15"/>
+                <w:szCs w:val="15"/>
+              </w:rPr>
+              <w:t xml:space="preserve">       SUM(l.valor_total)      AS faturamento_total</w:t>
+            </w:r>
+          </w:p>
+          <w:p>
+            <w:pPr>
+              <w:spacing w:after="0" w:line="220"/>
+            </w:pPr>
+            <w:r>
+              <w:rPr>
+                <w:rFonts w:ascii="Courier New" w:cs="Courier New" w:eastAsia="Courier New" w:hAnsi="Courier New"/>
+                <w:sz w:val="15"/>
+                <w:szCs w:val="15"/>
+              </w:rPr>
+              <w:t xml:space="preserve">FROM filial f</w:t>
+            </w:r>
+          </w:p>
+          <w:p>
+            <w:pPr>
+              <w:spacing w:after="0" w:line="220"/>
+            </w:pPr>
+            <w:r>
+              <w:rPr>
+                <w:rFonts w:ascii="Courier New" w:cs="Courier New" w:eastAsia="Courier New" w:hAnsi="Courier New"/>
+                <w:sz w:val="15"/>
+                <w:szCs w:val="15"/>
+              </w:rPr>
+              <w:t xml:space="preserve">JOIN locacao l ON l.id_filial_retirada = f.id_filial</w:t>
+            </w:r>
+          </w:p>
+          <w:p>
+            <w:pPr>
+              <w:spacing w:after="0" w:line="220"/>
+            </w:pPr>
+            <w:r>
+              <w:rPr>
+                <w:rFonts w:ascii="Courier New" w:cs="Courier New" w:eastAsia="Courier New" w:hAnsi="Courier New"/>
+                <w:sz w:val="15"/>
+                <w:szCs w:val="15"/>
+              </w:rPr>
+              <w:t xml:space="preserve">WHERE l.status = 'FINALIZADA'</w:t>
+            </w:r>
+          </w:p>
+          <w:p>
+            <w:pPr>
+              <w:spacing w:after="0" w:line="220"/>
+            </w:pPr>
+            <w:r>
+              <w:rPr>
+                <w:rFonts w:ascii="Courier New" w:cs="Courier New" w:eastAsia="Courier New" w:hAnsi="Courier New"/>
+                <w:sz w:val="15"/>
+                <w:szCs w:val="15"/>
+              </w:rPr>
+              <w:t xml:space="preserve">GROUP BY f.id_filial, f.nome, f.cidade</w:t>
+            </w:r>
+          </w:p>
+          <w:p>
+            <w:pPr>
+              <w:spacing w:after="0" w:line="220"/>
+            </w:pPr>
+            <w:r>
+              <w:rPr>
+                <w:rFonts w:ascii="Courier New" w:cs="Courier New" w:eastAsia="Courier New" w:hAnsi="Courier New"/>
+                <w:sz w:val="15"/>
+                <w:szCs w:val="15"/>
+              </w:rPr>
+              <w:t xml:space="preserve">ORDER BY faturamento_total DESC;</w:t>
+            </w:r>
+          </w:p>
+        </w:tc>
+      </w:tr>
+    </w:tbl>
+    <w:p>
+      <w:pPr>
+        <w:spacing w:after="0" w:before="120"/>
+        <w:jc w:val="center"/>
+      </w:pPr>
+      <w:r>
+        <w:drawing>
+          <wp:inline distT="0" distB="0" distL="0" distR="0">
+            <wp:extent cx="3200400" cy="762000"/>
+            <wp:effectExtent t="0" r="0" b="0" l="0"/>
+            <wp:docPr id="1" name="" descr="" title=""/>
+            <wp:cNvGraphicFramePr>
+              <a:graphicFrameLocks xmlns:a="http://schemas.openxmlformats.org/drawingml/2006/main" noChangeAspect="1"/>
+            </wp:cNvGraphicFramePr>
+            <a:graphic xmlns:a="http://schemas.openxmlformats.org/drawingml/2006/main">
+              <a:graphicData uri="http://schemas.openxmlformats.org/drawingml/2006/picture">
+                <pic:pic xmlns:pic="http://schemas.openxmlformats.org/drawingml/2006/picture">
+                  <pic:nvPicPr>
+                    <pic:cNvPr id="0" name="" descr=""/>
+                    <pic:cNvPicPr>
+                      <a:picLocks noChangeAspect="1" noChangeArrowheads="1"/>
+                    </pic:cNvPicPr>
+                  </pic:nvPicPr>
+                  <pic:blipFill>
+                    <a:blip r:embed="rId11" cstate="none"/>
+                    <a:srcRect/>
+                    <a:stretch>
+                      <a:fillRect/>
+                    </a:stretch>
+                  </pic:blipFill>
+                  <pic:spPr bwMode="auto">
+                    <a:xfrm>
+                      <a:off x="0" y="0"/>
+                      <a:ext cx="3200400" cy="762000"/>
+                    </a:xfrm>
+                    <a:prstGeom prst="rect">
+                      <a:avLst/>
+                    </a:prstGeom>
+                  </pic:spPr>
+                </pic:pic>
+              </a:graphicData>
+            </a:graphic>
+          </wp:inline>
+        </w:drawing>
       </w:r>
     </w:p>
     <w:p>
       <w:pPr>
-        <w:spacing w:after="120"/>
+        <w:spacing w:after="120" w:before="120"/>
+        <w:jc w:val="both"/>
+      </w:pPr>
+      <w:r>
+        <w:rPr>
+          <w:rFonts w:ascii="Times New Roman" w:cs="Times New Roman" w:eastAsia="Times New Roman" w:hAnsi="Times New Roman"/>
+          <w:sz w:val="16"/>
+          <w:szCs w:val="16"/>
+        </w:rPr>
+        <w:t xml:space="preserve">Figura 5.  </w:t>
+      </w:r>
+      <w:r>
+        <w:rPr>
+          <w:rFonts w:ascii="Times New Roman" w:cs="Times New Roman" w:eastAsia="Times New Roman" w:hAnsi="Times New Roman"/>
+          <w:sz w:val="16"/>
+          <w:szCs w:val="16"/>
+        </w:rPr>
+        <w:t xml:space="preserve">Resultado da consulta 4. Faturamento acumulado por filial de retirada, considerando apenas contratos encerrados.</w:t>
+      </w:r>
+    </w:p>
+    <w:p>
+      <w:pPr>
+        <w:sectPr>
+          <w:type w:val="continuous"/>
+          <w:pgSz w:w="11906" w:h="16838" w:orient="portrait"/>
+          <w:pgMar w:top="1080" w:right="900" w:bottom="1440" w:left="900" w:header="708" w:footer="708" w:gutter="0"/>
+          <w:pgNumType/>
+          <w:cols w:num="1"/>
+          <w:docGrid w:linePitch="360"/>
+        </w:sectPr>
+      </w:pPr>
+    </w:p>
+    <w:p>
+      <w:pPr>
+        <w:spacing w:after="0" w:before="60"/>
+        <w:ind w:firstLine="288"/>
+        <w:jc w:val="both"/>
+      </w:pPr>
+      <w:r>
+        <w:rPr>
+          <w:rFonts w:ascii="Times New Roman" w:cs="Times New Roman" w:eastAsia="Times New Roman" w:hAnsi="Times New Roman"/>
+          <w:i/>
+          <w:iCs/>
+          <w:sz w:val="20"/>
+          <w:szCs w:val="20"/>
+        </w:rPr>
+        <w:t xml:space="preserve">5) Locações com atraso na devolução: </w:t>
+      </w:r>
+    </w:p>
+    <w:p>
+      <w:pPr>
+        <w:spacing w:after="60" w:line="240"/>
+        <w:jc w:val="both"/>
+      </w:pPr>
+      <w:r>
+        <w:rPr>
+          <w:rFonts w:ascii="Times New Roman" w:cs="Times New Roman" w:eastAsia="Times New Roman" w:hAnsi="Times New Roman"/>
+          <w:sz w:val="20"/>
+          <w:szCs w:val="20"/>
+        </w:rPr>
+        <w:t xml:space="preserve">Compara a data real com a data prevista de devolução e calcula a diferença em dias com </w:t>
+      </w:r>
+      <w:r>
+        <w:rPr>
+          <w:rFonts w:ascii="Courier New" w:cs="Courier New" w:eastAsia="Courier New" w:hAnsi="Courier New"/>
+          <w:sz w:val="18"/>
+          <w:szCs w:val="18"/>
+        </w:rPr>
+        <w:t xml:space="preserve">DATEDIFF</w:t>
+      </w:r>
+      <w:r>
+        <w:rPr>
+          <w:rFonts w:ascii="Times New Roman" w:cs="Times New Roman" w:eastAsia="Times New Roman" w:hAnsi="Times New Roman"/>
+          <w:sz w:val="20"/>
+          <w:szCs w:val="20"/>
+        </w:rPr>
+        <w:t xml:space="preserve">. A comparação direta entre as duas colunas só é possível porque ambas guardam o instante completo, e não apenas a data, o que foi definido no dicionário de dados. Contratos em aberto ficam fora da saída, já que a comparação com nulo não é verdadeira.</w:t>
+      </w:r>
+    </w:p>
+    <w:tbl>
+      <w:tblPr>
+        <w:tblW w:type="dxa" w:w="10106"/>
+        <w:tblBorders>
+          <w:top w:val="single" w:color="auto" w:sz="4"/>
+          <w:left w:val="single" w:color="auto" w:sz="4"/>
+          <w:bottom w:val="single" w:color="auto" w:sz="4"/>
+          <w:right w:val="single" w:color="auto" w:sz="4"/>
+          <w:insideH w:val="single" w:color="auto" w:sz="4"/>
+          <w:insideV w:val="single" w:color="auto" w:sz="4"/>
+        </w:tblBorders>
+      </w:tblPr>
+      <w:tblGrid>
+        <w:gridCol w:w="10106"/>
+      </w:tblGrid>
+      <w:tr>
+        <w:tc>
+          <w:tcPr>
+            <w:tcW w:type="dxa" w:w="10106"/>
+            <w:tcMar>
+              <w:top w:type="dxa" w:w="80"/>
+              <w:left w:type="dxa" w:w="100"/>
+              <w:bottom w:type="dxa" w:w="80"/>
+              <w:right w:type="dxa" w:w="100"/>
+            </w:tcMar>
+          </w:tcPr>
+          <w:p>
+            <w:pPr>
+              <w:spacing w:after="0" w:line="220"/>
+            </w:pPr>
+            <w:r>
+              <w:rPr>
+                <w:rFonts w:ascii="Courier New" w:cs="Courier New" w:eastAsia="Courier New" w:hAnsi="Courier New"/>
+                <w:sz w:val="15"/>
+                <w:szCs w:val="15"/>
+              </w:rPr>
+              <w:t xml:space="preserve">SELECT l.id_locacao,</w:t>
+            </w:r>
+          </w:p>
+          <w:p>
+            <w:pPr>
+              <w:spacing w:after="0" w:line="220"/>
+            </w:pPr>
+            <w:r>
+              <w:rPr>
+                <w:rFonts w:ascii="Courier New" w:cs="Courier New" w:eastAsia="Courier New" w:hAnsi="Courier New"/>
+                <w:sz w:val="15"/>
+                <w:szCs w:val="15"/>
+              </w:rPr>
+              <w:t xml:space="preserve">       c.nome                        AS cliente,</w:t>
+            </w:r>
+          </w:p>
+          <w:p>
+            <w:pPr>
+              <w:spacing w:after="0" w:line="220"/>
+            </w:pPr>
+            <w:r>
+              <w:rPr>
+                <w:rFonts w:ascii="Courier New" w:cs="Courier New" w:eastAsia="Courier New" w:hAnsi="Courier New"/>
+                <w:sz w:val="15"/>
+                <w:szCs w:val="15"/>
+              </w:rPr>
+              <w:t xml:space="preserve">       v.placa,</w:t>
+            </w:r>
+          </w:p>
+          <w:p>
+            <w:pPr>
+              <w:spacing w:after="0" w:line="220"/>
+            </w:pPr>
+            <w:r>
+              <w:rPr>
+                <w:rFonts w:ascii="Courier New" w:cs="Courier New" w:eastAsia="Courier New" w:hAnsi="Courier New"/>
+                <w:sz w:val="15"/>
+                <w:szCs w:val="15"/>
+              </w:rPr>
+              <w:t xml:space="preserve">       l.data_prevista_devolucao,</w:t>
+            </w:r>
+          </w:p>
+          <w:p>
+            <w:pPr>
+              <w:spacing w:after="0" w:line="220"/>
+            </w:pPr>
+            <w:r>
+              <w:rPr>
+                <w:rFonts w:ascii="Courier New" w:cs="Courier New" w:eastAsia="Courier New" w:hAnsi="Courier New"/>
+                <w:sz w:val="15"/>
+                <w:szCs w:val="15"/>
+              </w:rPr>
+              <w:t xml:space="preserve">       l.data_real_devolucao,</w:t>
+            </w:r>
+          </w:p>
+          <w:p>
+            <w:pPr>
+              <w:spacing w:after="0" w:line="220"/>
+            </w:pPr>
+            <w:r>
+              <w:rPr>
+                <w:rFonts w:ascii="Courier New" w:cs="Courier New" w:eastAsia="Courier New" w:hAnsi="Courier New"/>
+                <w:sz w:val="15"/>
+                <w:szCs w:val="15"/>
+              </w:rPr>
+              <w:t xml:space="preserve">       DATEDIFF(l.data_real_devolucao, l.data_prevista_devolucao) AS dias_de_atraso</w:t>
+            </w:r>
+          </w:p>
+          <w:p>
+            <w:pPr>
+              <w:spacing w:after="0" w:line="220"/>
+            </w:pPr>
+            <w:r>
+              <w:rPr>
+                <w:rFonts w:ascii="Courier New" w:cs="Courier New" w:eastAsia="Courier New" w:hAnsi="Courier New"/>
+                <w:sz w:val="15"/>
+                <w:szCs w:val="15"/>
+              </w:rPr>
+              <w:t xml:space="preserve">FROM locacao l</w:t>
+            </w:r>
+          </w:p>
+          <w:p>
+            <w:pPr>
+              <w:spacing w:after="0" w:line="220"/>
+            </w:pPr>
+            <w:r>
+              <w:rPr>
+                <w:rFonts w:ascii="Courier New" w:cs="Courier New" w:eastAsia="Courier New" w:hAnsi="Courier New"/>
+                <w:sz w:val="15"/>
+                <w:szCs w:val="15"/>
+              </w:rPr>
+              <w:t xml:space="preserve">JOIN cliente c ON c.id_cliente = l.id_cliente</w:t>
+            </w:r>
+          </w:p>
+          <w:p>
+            <w:pPr>
+              <w:spacing w:after="0" w:line="220"/>
+            </w:pPr>
+            <w:r>
+              <w:rPr>
+                <w:rFonts w:ascii="Courier New" w:cs="Courier New" w:eastAsia="Courier New" w:hAnsi="Courier New"/>
+                <w:sz w:val="15"/>
+                <w:szCs w:val="15"/>
+              </w:rPr>
+              <w:t xml:space="preserve">JOIN veiculo v ON v.id_veiculo = l.id_veiculo</w:t>
+            </w:r>
+          </w:p>
+          <w:p>
+            <w:pPr>
+              <w:spacing w:after="0" w:line="220"/>
+            </w:pPr>
+            <w:r>
+              <w:rPr>
+                <w:rFonts w:ascii="Courier New" w:cs="Courier New" w:eastAsia="Courier New" w:hAnsi="Courier New"/>
+                <w:sz w:val="15"/>
+                <w:szCs w:val="15"/>
+              </w:rPr>
+              <w:t xml:space="preserve">WHERE l.data_real_devolucao &gt; l.data_prevista_devolucao</w:t>
+            </w:r>
+          </w:p>
+          <w:p>
+            <w:pPr>
+              <w:spacing w:after="0" w:line="220"/>
+            </w:pPr>
+            <w:r>
+              <w:rPr>
+                <w:rFonts w:ascii="Courier New" w:cs="Courier New" w:eastAsia="Courier New" w:hAnsi="Courier New"/>
+                <w:sz w:val="15"/>
+                <w:szCs w:val="15"/>
+              </w:rPr>
+              <w:t xml:space="preserve">ORDER BY dias_de_atraso DESC, l.id_locacao;</w:t>
+            </w:r>
+          </w:p>
+        </w:tc>
+      </w:tr>
+    </w:tbl>
+    <w:p>
+      <w:pPr>
+        <w:spacing w:after="0" w:before="120"/>
+        <w:jc w:val="center"/>
+      </w:pPr>
+      <w:r>
+        <w:drawing>
+          <wp:inline distT="0" distB="0" distL="0" distR="0">
+            <wp:extent cx="4362450" cy="571500"/>
+            <wp:effectExtent t="0" r="0" b="0" l="0"/>
+            <wp:docPr id="1" name="" descr="" title=""/>
+            <wp:cNvGraphicFramePr>
+              <a:graphicFrameLocks xmlns:a="http://schemas.openxmlformats.org/drawingml/2006/main" noChangeAspect="1"/>
+            </wp:cNvGraphicFramePr>
+            <a:graphic xmlns:a="http://schemas.openxmlformats.org/drawingml/2006/main">
+              <a:graphicData uri="http://schemas.openxmlformats.org/drawingml/2006/picture">
+                <pic:pic xmlns:pic="http://schemas.openxmlformats.org/drawingml/2006/picture">
+                  <pic:nvPicPr>
+                    <pic:cNvPr id="0" name="" descr=""/>
+                    <pic:cNvPicPr>
+                      <a:picLocks noChangeAspect="1" noChangeArrowheads="1"/>
+                    </pic:cNvPicPr>
+                  </pic:nvPicPr>
+                  <pic:blipFill>
+                    <a:blip r:embed="rId12" cstate="none"/>
+                    <a:srcRect/>
+                    <a:stretch>
+                      <a:fillRect/>
+                    </a:stretch>
+                  </pic:blipFill>
+                  <pic:spPr bwMode="auto">
+                    <a:xfrm>
+                      <a:off x="0" y="0"/>
+                      <a:ext cx="4362450" cy="571500"/>
+                    </a:xfrm>
+                    <a:prstGeom prst="rect">
+                      <a:avLst/>
+                    </a:prstGeom>
+                  </pic:spPr>
+                </pic:pic>
+              </a:graphicData>
+            </a:graphic>
+          </wp:inline>
+        </w:drawing>
+      </w:r>
+    </w:p>
+    <w:p>
+      <w:pPr>
+        <w:spacing w:after="120" w:before="120"/>
+        <w:jc w:val="both"/>
+      </w:pPr>
+      <w:r>
+        <w:rPr>
+          <w:rFonts w:ascii="Times New Roman" w:cs="Times New Roman" w:eastAsia="Times New Roman" w:hAnsi="Times New Roman"/>
+          <w:sz w:val="16"/>
+          <w:szCs w:val="16"/>
+        </w:rPr>
+        <w:t xml:space="preserve">Figura 6.  </w:t>
+      </w:r>
+      <w:r>
+        <w:rPr>
+          <w:rFonts w:ascii="Times New Roman" w:cs="Times New Roman" w:eastAsia="Times New Roman" w:hAnsi="Times New Roman"/>
+          <w:sz w:val="16"/>
+          <w:szCs w:val="16"/>
+        </w:rPr>
+        <w:t xml:space="preserve">Resultado da consulta 5. Três devoluções fora do prazo, ordenadas pelo número de dias de atraso.</w:t>
+      </w:r>
+    </w:p>
+    <w:p>
+      <w:pPr>
+        <w:sectPr>
+          <w:type w:val="continuous"/>
+          <w:pgSz w:w="11906" w:h="16838" w:orient="portrait"/>
+          <w:pgMar w:top="1080" w:right="900" w:bottom="1440" w:left="900" w:header="708" w:footer="708" w:gutter="0"/>
+          <w:pgNumType/>
+          <w:cols w:num="1"/>
+          <w:docGrid w:linePitch="360"/>
+        </w:sectPr>
+      </w:pPr>
+    </w:p>
+    <w:p>
+      <w:pPr>
+        <w:spacing w:after="0" w:before="60"/>
+        <w:ind w:firstLine="288"/>
+        <w:jc w:val="both"/>
+      </w:pPr>
+      <w:r>
+        <w:rPr>
+          <w:rFonts w:ascii="Times New Roman" w:cs="Times New Roman" w:eastAsia="Times New Roman" w:hAnsi="Times New Roman"/>
+          <w:i/>
+          <w:iCs/>
+          <w:sz w:val="20"/>
+          <w:szCs w:val="20"/>
+        </w:rPr>
+        <w:t xml:space="preserve">6) Custo de manutenção por veículo: </w:t>
+      </w:r>
+    </w:p>
+    <w:p>
+      <w:pPr>
+        <w:spacing w:after="60" w:line="240"/>
+        <w:jc w:val="both"/>
+      </w:pPr>
+      <w:r>
+        <w:rPr>
+          <w:rFonts w:ascii="Times New Roman" w:cs="Times New Roman" w:eastAsia="Times New Roman" w:hAnsi="Times New Roman"/>
+          <w:sz w:val="20"/>
+          <w:szCs w:val="20"/>
+        </w:rPr>
+        <w:t xml:space="preserve">Consulta prevista como opcional no enunciado e incluída porque a entidade MANUTENCAO faz parte do modelo. Agrega quantidade, custo total e custo médio por veículo. O custo médio evidencia a diferença entre um veículo com uma única intervenção cara e outro com intervenções recorrentes de menor valor, informação que o custo total sozinho não separa.</w:t>
+      </w:r>
+    </w:p>
+    <w:tbl>
+      <w:tblPr>
+        <w:tblW w:type="dxa" w:w="10106"/>
+        <w:tblBorders>
+          <w:top w:val="single" w:color="auto" w:sz="4"/>
+          <w:left w:val="single" w:color="auto" w:sz="4"/>
+          <w:bottom w:val="single" w:color="auto" w:sz="4"/>
+          <w:right w:val="single" w:color="auto" w:sz="4"/>
+          <w:insideH w:val="single" w:color="auto" w:sz="4"/>
+          <w:insideV w:val="single" w:color="auto" w:sz="4"/>
+        </w:tblBorders>
+      </w:tblPr>
+      <w:tblGrid>
+        <w:gridCol w:w="10106"/>
+      </w:tblGrid>
+      <w:tr>
+        <w:tc>
+          <w:tcPr>
+            <w:tcW w:type="dxa" w:w="10106"/>
+            <w:tcMar>
+              <w:top w:type="dxa" w:w="80"/>
+              <w:left w:type="dxa" w:w="100"/>
+              <w:bottom w:type="dxa" w:w="80"/>
+              <w:right w:type="dxa" w:w="100"/>
+            </w:tcMar>
+          </w:tcPr>
+          <w:p>
+            <w:pPr>
+              <w:spacing w:after="0" w:line="220"/>
+            </w:pPr>
+            <w:r>
+              <w:rPr>
+                <w:rFonts w:ascii="Courier New" w:cs="Courier New" w:eastAsia="Courier New" w:hAnsi="Courier New"/>
+                <w:sz w:val="15"/>
+                <w:szCs w:val="15"/>
+              </w:rPr>
+              <w:t xml:space="preserve">SELECT v.placa,</w:t>
+            </w:r>
+          </w:p>
+          <w:p>
+            <w:pPr>
+              <w:spacing w:after="0" w:line="220"/>
+            </w:pPr>
+            <w:r>
+              <w:rPr>
+                <w:rFonts w:ascii="Courier New" w:cs="Courier New" w:eastAsia="Courier New" w:hAnsi="Courier New"/>
+                <w:sz w:val="15"/>
+                <w:szCs w:val="15"/>
+              </w:rPr>
+              <w:t xml:space="preserve">       CONCAT(v.marca, ' ', v.modelo)   AS veiculo,</w:t>
+            </w:r>
+          </w:p>
+          <w:p>
+            <w:pPr>
+              <w:spacing w:after="0" w:line="220"/>
+            </w:pPr>
+            <w:r>
+              <w:rPr>
+                <w:rFonts w:ascii="Courier New" w:cs="Courier New" w:eastAsia="Courier New" w:hAnsi="Courier New"/>
+                <w:sz w:val="15"/>
+                <w:szCs w:val="15"/>
+              </w:rPr>
+              <w:t xml:space="preserve">       COUNT(m.id_manutencao)           AS qtd_manutencoes,</w:t>
+            </w:r>
+          </w:p>
+          <w:p>
+            <w:pPr>
+              <w:spacing w:after="0" w:line="220"/>
+            </w:pPr>
+            <w:r>
+              <w:rPr>
+                <w:rFonts w:ascii="Courier New" w:cs="Courier New" w:eastAsia="Courier New" w:hAnsi="Courier New"/>
+                <w:sz w:val="15"/>
+                <w:szCs w:val="15"/>
+              </w:rPr>
+              <w:t xml:space="preserve">       SUM(m.custo)                     AS custo_total,</w:t>
+            </w:r>
+          </w:p>
+          <w:p>
+            <w:pPr>
+              <w:spacing w:after="0" w:line="220"/>
+            </w:pPr>
+            <w:r>
+              <w:rPr>
+                <w:rFonts w:ascii="Courier New" w:cs="Courier New" w:eastAsia="Courier New" w:hAnsi="Courier New"/>
+                <w:sz w:val="15"/>
+                <w:szCs w:val="15"/>
+              </w:rPr>
+              <w:t xml:space="preserve">       ROUND(AVG(m.custo), 2)           AS custo_medio</w:t>
+            </w:r>
+          </w:p>
+          <w:p>
+            <w:pPr>
+              <w:spacing w:after="0" w:line="220"/>
+            </w:pPr>
+            <w:r>
+              <w:rPr>
+                <w:rFonts w:ascii="Courier New" w:cs="Courier New" w:eastAsia="Courier New" w:hAnsi="Courier New"/>
+                <w:sz w:val="15"/>
+                <w:szCs w:val="15"/>
+              </w:rPr>
+              <w:t xml:space="preserve">FROM veiculo v</w:t>
+            </w:r>
+          </w:p>
+          <w:p>
+            <w:pPr>
+              <w:spacing w:after="0" w:line="220"/>
+            </w:pPr>
+            <w:r>
+              <w:rPr>
+                <w:rFonts w:ascii="Courier New" w:cs="Courier New" w:eastAsia="Courier New" w:hAnsi="Courier New"/>
+                <w:sz w:val="15"/>
+                <w:szCs w:val="15"/>
+              </w:rPr>
+              <w:t xml:space="preserve">JOIN manutencao m ON m.id_veiculo = v.id_veiculo</w:t>
+            </w:r>
+          </w:p>
+          <w:p>
+            <w:pPr>
+              <w:spacing w:after="0" w:line="220"/>
+            </w:pPr>
+            <w:r>
+              <w:rPr>
+                <w:rFonts w:ascii="Courier New" w:cs="Courier New" w:eastAsia="Courier New" w:hAnsi="Courier New"/>
+                <w:sz w:val="15"/>
+                <w:szCs w:val="15"/>
+              </w:rPr>
+              <w:t xml:space="preserve">GROUP BY v.id_veiculo, v.placa, v.marca, v.modelo</w:t>
+            </w:r>
+          </w:p>
+          <w:p>
+            <w:pPr>
+              <w:spacing w:after="0" w:line="220"/>
+            </w:pPr>
+            <w:r>
+              <w:rPr>
+                <w:rFonts w:ascii="Courier New" w:cs="Courier New" w:eastAsia="Courier New" w:hAnsi="Courier New"/>
+                <w:sz w:val="15"/>
+                <w:szCs w:val="15"/>
+              </w:rPr>
+              <w:t xml:space="preserve">ORDER BY custo_total DESC;</w:t>
+            </w:r>
+          </w:p>
+        </w:tc>
+      </w:tr>
+    </w:tbl>
+    <w:p>
+      <w:pPr>
+        <w:spacing w:after="0" w:before="120"/>
+        <w:jc w:val="center"/>
+      </w:pPr>
+      <w:r>
+        <w:drawing>
+          <wp:inline distT="0" distB="0" distL="0" distR="0">
+            <wp:extent cx="3629025" cy="1228725"/>
+            <wp:effectExtent t="0" r="0" b="0" l="0"/>
+            <wp:docPr id="1" name="" descr="" title=""/>
+            <wp:cNvGraphicFramePr>
+              <a:graphicFrameLocks xmlns:a="http://schemas.openxmlformats.org/drawingml/2006/main" noChangeAspect="1"/>
+            </wp:cNvGraphicFramePr>
+            <a:graphic xmlns:a="http://schemas.openxmlformats.org/drawingml/2006/main">
+              <a:graphicData uri="http://schemas.openxmlformats.org/drawingml/2006/picture">
+                <pic:pic xmlns:pic="http://schemas.openxmlformats.org/drawingml/2006/picture">
+                  <pic:nvPicPr>
+                    <pic:cNvPr id="0" name="" descr=""/>
+                    <pic:cNvPicPr>
+                      <a:picLocks noChangeAspect="1" noChangeArrowheads="1"/>
+                    </pic:cNvPicPr>
+                  </pic:nvPicPr>
+                  <pic:blipFill>
+                    <a:blip r:embed="rId13" cstate="none"/>
+                    <a:srcRect/>
+                    <a:stretch>
+                      <a:fillRect/>
+                    </a:stretch>
+                  </pic:blipFill>
+                  <pic:spPr bwMode="auto">
+                    <a:xfrm>
+                      <a:off x="0" y="0"/>
+                      <a:ext cx="3629025" cy="1228725"/>
+                    </a:xfrm>
+                    <a:prstGeom prst="rect">
+                      <a:avLst/>
+                    </a:prstGeom>
+                  </pic:spPr>
+                </pic:pic>
+              </a:graphicData>
+            </a:graphic>
+          </wp:inline>
+        </w:drawing>
+      </w:r>
+    </w:p>
+    <w:p>
+      <w:pPr>
+        <w:spacing w:after="120" w:before="120"/>
+        <w:jc w:val="both"/>
+      </w:pPr>
+      <w:r>
+        <w:rPr>
+          <w:rFonts w:ascii="Times New Roman" w:cs="Times New Roman" w:eastAsia="Times New Roman" w:hAnsi="Times New Roman"/>
+          <w:sz w:val="16"/>
+          <w:szCs w:val="16"/>
+        </w:rPr>
+        <w:t xml:space="preserve">Figura 7.  </w:t>
+      </w:r>
+      <w:r>
+        <w:rPr>
+          <w:rFonts w:ascii="Times New Roman" w:cs="Times New Roman" w:eastAsia="Times New Roman" w:hAnsi="Times New Roman"/>
+          <w:sz w:val="16"/>
+          <w:szCs w:val="16"/>
+        </w:rPr>
+        <w:t xml:space="preserve">Resultado da consulta 6. Custo de manutenção acumulado e médio por veículo.</w:t>
+      </w:r>
+    </w:p>
+    <w:p>
+      <w:pPr>
+        <w:sectPr>
+          <w:type w:val="continuous"/>
+          <w:pgSz w:w="11906" w:h="16838" w:orient="portrait"/>
+          <w:pgMar w:top="1080" w:right="900" w:bottom="1440" w:left="900" w:header="708" w:footer="708" w:gutter="0"/>
+          <w:pgNumType/>
+          <w:cols w:num="1"/>
+          <w:docGrid w:linePitch="360"/>
+        </w:sectPr>
       </w:pPr>
     </w:p>
     <w:p>
@@ -16967,7 +18982,7 @@
           <w:sz w:val="20"/>
           <w:szCs w:val="20"/>
         </w:rPr>
-        <w:t xml:space="preserve">Responsável pela modelagem entidade-relacionamento, pela definição das cardinalidades e pela representação dos dois relacionamentos independentes entre LOCACAO e FILIAL. Trabalhou também a resolução do relacionamento N:N entre cliente e veículo por meio da tabela associativa. A maior dificuldade foi decidir entre chave composta e chave substituta em LOCACAO, resolvida pela constatação de que o mesmo cliente pode alugar o mesmo veículo mais de uma vez.</w:t>
+        <w:t xml:space="preserve">Responsável pela modelagem entidade-relacionamento, pela definição das cardinalidades e pela representação dos dois relacionamentos independentes entre LOCACAO e FILIAL. Trabalhou também a resolução do relacionamento N:N entre cliente e veículo por meio da tabela associativa, e executou o script de criação e a carga no MySQL, registrando as capturas de tela da Seção VI. A maior dificuldade foi decidir entre chave composta e chave substituta em LOCACAO, resolvida pela constatação de que o mesmo cliente pode alugar o mesmo veículo mais de uma vez.</w:t>
       </w:r>
     </w:p>
     <w:p>
@@ -17052,7 +19067,7 @@
           <w:sz w:val="20"/>
           <w:szCs w:val="20"/>
         </w:rPr>
-        <w:t xml:space="preserve">O próximo passo é a implementação do script de criação no MySQL 8, a carga de ao menos cinco registros por tabela e a execução das seis consultas previstas na Seção VI.</w:t>
+        <w:t xml:space="preserve">As Etapas 4 e 5 confirmaram o modelo na prática. O script de criação foi executado no MySQL 8 sem nenhum ajuste no modelo lógico, a carga cobriu as sete tabelas e as seis consultas obrigatórias devolveram resultados coerentes, apresentados na Seção VI. A decomposição em 3FN se mostrou adequada também na escrita das consultas: nenhuma delas precisou de subconsulta correlacionada ou de tratamento de redundância, e todas foram resolvidas com junção e agregação diretas.</w:t>
       </w:r>
     </w:p>
     <w:p>

</xml_diff>